<commit_message>
Bozza primi documenti per la consegna
Aggiunta prima versione dei documenti Requisiti e Gestione del progetto.
</commit_message>
<xml_diff>
--- a/documentazione/Gestione del progetto.docx
+++ b/documentazione/Gestione del progetto.docx
@@ -3,105 +3,34 @@
 <w:document xmlns:wpc="http://schemas.microsoft.com/office/word/2010/wordprocessingCanvas" xmlns:cx="http://schemas.microsoft.com/office/drawing/2014/chartex" xmlns:cx1="http://schemas.microsoft.com/office/drawing/2015/9/8/chartex" xmlns:cx2="http://schemas.microsoft.com/office/drawing/2015/10/21/chartex" xmlns:cx3="http://schemas.microsoft.com/office/drawing/2016/5/9/chartex" xmlns:cx4="http://schemas.microsoft.com/office/drawing/2016/5/10/chartex" xmlns:cx5="http://schemas.microsoft.com/office/drawing/2016/5/11/chartex" xmlns:cx6="http://schemas.microsoft.com/office/drawing/2016/5/12/chartex" xmlns:cx7="http://schemas.microsoft.com/office/drawing/2016/5/13/chartex" xmlns:cx8="http://schemas.microsoft.com/office/drawing/2016/5/14/chartex" xmlns:mc="http://schemas.openxmlformats.org/markup-compatibility/2006" xmlns:aink="http://schemas.microsoft.com/office/drawing/2016/ink" xmlns:am3d="http://schemas.microsoft.com/office/drawing/2017/model3d" xmlns:o="urn:schemas-microsoft-com:office:office" xmlns:oel="http://schemas.microsoft.com/office/2019/extlst" xmlns:r="http://schemas.openxmlformats.org/officeDocument/2006/relationships" xmlns:m="http://schemas.openxmlformats.org/officeDocument/2006/math" xmlns:v="urn:schemas-microsoft-com:vml" xmlns:wp14="http://schemas.microsoft.com/office/word/2010/wordprocessingDrawing" xmlns:wp="http://schemas.openxmlformats.org/drawingml/2006/wordprocessingDrawing" xmlns:w10="urn:schemas-microsoft-com:office:word" xmlns:w="http://schemas.openxmlformats.org/wordprocessingml/2006/main" xmlns:w14="http://schemas.microsoft.com/office/word/2010/wordml" xmlns:w15="http://schemas.microsoft.com/office/word/2012/wordml" xmlns:w16cex="http://schemas.microsoft.com/office/word/2018/wordml/cex" xmlns:w16cid="http://schemas.microsoft.com/office/word/2016/wordml/cid" xmlns:w16="http://schemas.microsoft.com/office/word/2018/wordml" xmlns:w16du="http://schemas.microsoft.com/office/word/2023/wordml/word16du" xmlns:w16sdtdh="http://schemas.microsoft.com/office/word/2020/wordml/sdtdatahash" xmlns:w16sdtfl="http://schemas.microsoft.com/office/word/2024/wordml/sdtformatlock" xmlns:w16se="http://schemas.microsoft.com/office/word/2015/wordml/symex" xmlns:wpg="http://schemas.microsoft.com/office/word/2010/wordprocessingGroup" xmlns:wpi="http://schemas.microsoft.com/office/word/2010/wordprocessingInk" xmlns:wne="http://schemas.microsoft.com/office/word/2006/wordml" xmlns:wps="http://schemas.microsoft.com/office/word/2010/wordprocessingShape" mc:Ignorable="w14 w15 w16se w16cid w16 w16cex w16sdtdh w16sdtfl w16du wp14">
   <w:body>
     <w:p>
-      <w:r>
-        <w:t>GESTIONE DEL PROGETTO</w:t>
-      </w:r>
-    </w:p>
-    <w:p/>
-    <w:p>
       <w:pPr>
         <w:rPr>
           <w:b/>
           <w:bCs/>
+          <w:i/>
+          <w:iCs/>
         </w:rPr>
       </w:pPr>
       <w:r>
         <w:rPr>
           <w:b/>
           <w:bCs/>
-        </w:rPr>
-        <w:t xml:space="preserve">Software Life </w:t>
-      </w:r>
-      <w:proofErr w:type="spellStart"/>
-      <w:r>
+          <w:i/>
+          <w:iCs/>
+        </w:rPr>
+        <w:t>GESTIONE DEL PROGETTO</w:t>
+      </w:r>
+    </w:p>
+    <w:p>
+      <w:pPr>
         <w:rPr>
           <w:b/>
           <w:bCs/>
-        </w:rPr>
-        <w:t>Cycle</w:t>
-      </w:r>
-      <w:proofErr w:type="spellEnd"/>
-    </w:p>
-    <w:p>
-      <w:r>
-        <w:t xml:space="preserve">DEVE indicare il tipo di processo di sviluppo seguito PUO’ formalizzare con diagramma UML una piccola parte del </w:t>
-      </w:r>
-      <w:proofErr w:type="spellStart"/>
-      <w:r>
-        <w:t>sw</w:t>
-      </w:r>
-      <w:proofErr w:type="spellEnd"/>
-      <w:r>
-        <w:t xml:space="preserve"> </w:t>
-      </w:r>
-      <w:proofErr w:type="spellStart"/>
-      <w:r>
-        <w:t>development</w:t>
-      </w:r>
-      <w:proofErr w:type="spellEnd"/>
-      <w:r>
-        <w:t xml:space="preserve"> (ad esempio una </w:t>
-      </w:r>
-      <w:proofErr w:type="spellStart"/>
-      <w:r>
-        <w:t>change</w:t>
-      </w:r>
-      <w:proofErr w:type="spellEnd"/>
-      <w:r>
-        <w:t xml:space="preserve"> </w:t>
-      </w:r>
-      <w:proofErr w:type="spellStart"/>
-      <w:r>
-        <w:t>request</w:t>
-      </w:r>
-      <w:proofErr w:type="spellEnd"/>
-      <w:r>
-        <w:t xml:space="preserve"> come viene trattata) DOVREBBE anche usare un approccio MDA o parte di esso (con </w:t>
-      </w:r>
-      <w:proofErr w:type="spellStart"/>
-      <w:r>
-        <w:t>Yakindu</w:t>
-      </w:r>
-      <w:proofErr w:type="spellEnd"/>
-      <w:r>
-        <w:t xml:space="preserve"> o </w:t>
-      </w:r>
-      <w:proofErr w:type="spellStart"/>
-      <w:r>
-        <w:t>Papyrus</w:t>
-      </w:r>
-      <w:proofErr w:type="spellEnd"/>
-      <w:r>
-        <w:t xml:space="preserve"> UML come visto in classe) POTREBBE presentare il progetto come SPL </w:t>
-      </w:r>
-    </w:p>
-    <w:p>
-      <w:r>
-        <w:t xml:space="preserve">Documentazione: breve documento in cui indicare il tipo di processo seguito effettivamente. Eventuali differenze rispetto a quanto previsto nel project plan vanno indicate qui. Anche ad esempio come sono stati organizzati il </w:t>
-      </w:r>
-      <w:proofErr w:type="spellStart"/>
-      <w:r>
-        <w:t>timebox</w:t>
-      </w:r>
-      <w:proofErr w:type="spellEnd"/>
-      <w:r>
-        <w:t xml:space="preserve"> o gli sprint (ad esempio con le date) vanno indicati qu</w:t>
-      </w:r>
-      <w:r>
-        <w:t>i</w:t>
-      </w:r>
-    </w:p>
-    <w:p/>
+          <w:i/>
+          <w:iCs/>
+        </w:rPr>
+      </w:pPr>
+    </w:p>
     <w:p>
       <w:pPr>
         <w:rPr>
@@ -109,149 +38,260 @@
           <w:bCs/>
         </w:rPr>
       </w:pPr>
-      <w:proofErr w:type="spellStart"/>
       <w:r>
         <w:rPr>
           <w:b/>
           <w:bCs/>
         </w:rPr>
-        <w:t>Configuration</w:t>
-      </w:r>
-      <w:proofErr w:type="spellEnd"/>
-      <w:r>
+        <w:t>Software Life Cycle</w:t>
+      </w:r>
+    </w:p>
+    <w:p>
+      <w:r>
+        <w:t xml:space="preserve">DEVE indicare il tipo di processo di sviluppo seguito PUO’ formalizzare con diagramma UML una piccola parte del sw development (ad esempio una change request come viene trattata) DOVREBBE anche usare un approccio MDA o parte di esso (con Yakindu o Papyrus UML come visto in classe) POTREBBE presentare il progetto come SPL </w:t>
+      </w:r>
+    </w:p>
+    <w:p>
+      <w:r>
+        <w:t>Documentazione: breve documento in cui indicare il tipo di processo seguito effettivamente. Eventuali differenze rispetto a quanto previsto nel project plan vanno indicate qui. Anche ad esempio come sono stati organizzati il timebox o gli sprint (ad esempio con le date) vanno indicati qu</w:t>
+      </w:r>
+      <w:r>
+        <w:t>i</w:t>
+      </w:r>
+    </w:p>
+    <w:p/>
+    <w:p>
+      <w:pPr>
+        <w:rPr>
+          <w:i/>
+          <w:iCs/>
+          <w:u w:val="single"/>
+        </w:rPr>
+      </w:pPr>
+      <w:r>
+        <w:rPr>
+          <w:i/>
+          <w:iCs/>
+          <w:u w:val="single"/>
+        </w:rPr>
+        <w:t>Processo di sviluppo: Agile Scrum</w:t>
+      </w:r>
+    </w:p>
+    <w:p>
+      <w:r>
+        <w:t>In conformità con quanto definito nel project plan , il team ha adottato un modello di progetto Agile ispirato a SCRUM, applicandolo in maniera più leggera per adattarsi alle esigenze del team.</w:t>
+      </w:r>
+    </w:p>
+    <w:p>
+      <w:r>
+        <w:t>Il ciclo di vita del software è stato suddiviso in 6 sprint, precedute da una fase di prototipazione che il team ha definito come sprint 0.</w:t>
+      </w:r>
+    </w:p>
+    <w:p>
+      <w:r>
+        <w:t>Ogni sprint era preceduto da uno sprint planning e seguito da una sprint review (ed eventualmente una sprint restrospective).</w:t>
+      </w:r>
+    </w:p>
+    <w:p>
+      <w:r>
+        <w:t>Durante la fase di esecuzione il team si aggiornava tramite Daily Scrum in presenze o asincrone online o tramite il gestore di configurazione.</w:t>
+      </w:r>
+    </w:p>
+    <w:p>
+      <w:r>
+        <w:t>Differenze con il project plan:</w:t>
+      </w:r>
+    </w:p>
+    <w:p>
+      <w:r>
+        <w:t>Pianificato:  la durata dello sprint era di 10 giorni circa</w:t>
+      </w:r>
+    </w:p>
+    <w:p>
+      <w:r>
+        <w:t>Effettivo: a causa di sessioni di esame la durata degli Sprint è diventata maggiormente flessibile, circa da 10 a 20 giorni in base al periodo. Questo adattamento è stato necessario e rispecchia la filosofia SCRUM riguardante il cambiamento.</w:t>
+      </w:r>
+    </w:p>
+    <w:p>
+      <w:r>
+        <w:t xml:space="preserve">La gestione degli sprint è stata la seguente (le stesse informazioni sono ritrovabili all’interno del file Meeting_Sprint): </w:t>
+      </w:r>
+    </w:p>
+    <w:p>
+      <w:r>
+        <w:t>Sprint 0 (Setup): 15/10 - 02/11 (Analisi, Scelta Tecnologie)</w:t>
+      </w:r>
+    </w:p>
+    <w:p>
+      <w:r>
+        <w:t>Sprint 1 (Core): 02/11 - 10/11 (Login, Registrazione)</w:t>
+      </w:r>
+    </w:p>
+    <w:p>
+      <w:r>
+        <w:t>Sprint 2 (</w:t>
+      </w:r>
+      <w:r>
+        <w:t>Mappa e database</w:t>
+      </w:r>
+      <w:r>
+        <w:t>): 10/11 - 19/11 (Mappa, Integrazione Firebase)</w:t>
+      </w:r>
+    </w:p>
+    <w:p>
+      <w:r>
+        <w:t>Sprint 3 (</w:t>
+      </w:r>
+      <w:r>
+        <w:t>Logica prenotazioni e controlli</w:t>
+      </w:r>
+      <w:r>
+        <w:t>): 19/11 - 27/11 (Prenotazioni, Logica business)</w:t>
+      </w:r>
+    </w:p>
+    <w:p>
+      <w:r>
+        <w:t>Sprint 4 (</w:t>
+      </w:r>
+      <w:r>
+        <w:t>QR e garage</w:t>
+      </w:r>
+      <w:r>
+        <w:t>): 28/11 - 10/12 (QR Code, Auto, Refactoring)</w:t>
+      </w:r>
+    </w:p>
+    <w:p>
+      <w:r>
+        <w:t>Sprint 5 (</w:t>
+      </w:r>
+      <w:r>
+        <w:t>Funzionalità secondarie</w:t>
+      </w:r>
+      <w:r>
+        <w:t>): 11/12 - 30/12 (Admin Dashboard, Geolocalizzazione)</w:t>
+      </w:r>
+    </w:p>
+    <w:p>
+      <w:r>
+        <w:t>Sprint 6 (</w:t>
+      </w:r>
+      <w:r>
+        <w:t>Finale</w:t>
+      </w:r>
+      <w:r>
+        <w:t>): Gennaio (Documentazione, Chiusura)</w:t>
+      </w:r>
+    </w:p>
+    <w:p/>
+    <w:p/>
+    <w:p>
+      <w:pPr>
+        <w:tabs>
+          <w:tab w:val="left" w:pos="1888"/>
+        </w:tabs>
+      </w:pPr>
+    </w:p>
+    <w:p>
+      <w:pPr>
+        <w:tabs>
+          <w:tab w:val="left" w:pos="1888"/>
+        </w:tabs>
+        <w:rPr>
+          <w:i/>
+          <w:iCs/>
+          <w:u w:val="single"/>
+        </w:rPr>
+      </w:pPr>
+      <w:r>
+        <w:rPr>
+          <w:i/>
+          <w:iCs/>
+          <w:u w:val="single"/>
+        </w:rPr>
+        <w:t>Approccio MDA</w:t>
+      </w:r>
+    </w:p>
+    <w:p>
+      <w:pPr>
+        <w:tabs>
+          <w:tab w:val="left" w:pos="1888"/>
+        </w:tabs>
+      </w:pPr>
+      <w:r>
+        <w:t>È stato utilizzato inizialmente un approccio MDA con stesura di diagrammi dei casi d’uso e della macchina a stati utili per definire i confini del sistema, le funzionalità dell’utente e il ciclo di vita dell’applicazione, dall’apertura alla conferma della prenotazione.</w:t>
+      </w:r>
+    </w:p>
+    <w:p>
+      <w:pPr>
+        <w:tabs>
+          <w:tab w:val="left" w:pos="1888"/>
+        </w:tabs>
+      </w:pPr>
+      <w:r>
+        <w:t>Essi sono stati utili poi a ricostruire il codice del sistema e a comprendere in maniera più chiara le interazioni tra gli attori.</w:t>
+      </w:r>
+    </w:p>
+    <w:p>
+      <w:pPr>
+        <w:tabs>
+          <w:tab w:val="left" w:pos="1888"/>
+        </w:tabs>
+      </w:pPr>
+    </w:p>
+    <w:p>
+      <w:pPr>
+        <w:tabs>
+          <w:tab w:val="left" w:pos="1888"/>
+        </w:tabs>
+      </w:pPr>
+    </w:p>
+    <w:p>
+      <w:pPr>
+        <w:tabs>
+          <w:tab w:val="left" w:pos="1888"/>
+        </w:tabs>
+      </w:pPr>
+      <w:r>
+        <w:t>----DIAGRAMMA DI GESTIONE MDA PUO ESSERE MESSO QUI-----</w:t>
+      </w:r>
+    </w:p>
+    <w:p>
+      <w:pPr>
+        <w:tabs>
+          <w:tab w:val="left" w:pos="1888"/>
+        </w:tabs>
+      </w:pPr>
+    </w:p>
+    <w:p>
+      <w:pPr>
+        <w:pStyle w:val="Paragrafoelenco"/>
+        <w:tabs>
+          <w:tab w:val="left" w:pos="1888"/>
+        </w:tabs>
+      </w:pPr>
+    </w:p>
+    <w:p>
+      <w:pPr>
+        <w:tabs>
+          <w:tab w:val="left" w:pos="1888"/>
+        </w:tabs>
+      </w:pPr>
+    </w:p>
+    <w:p>
+      <w:pPr>
+        <w:tabs>
+          <w:tab w:val="left" w:pos="1888"/>
+        </w:tabs>
+      </w:pPr>
+    </w:p>
+    <w:p>
+      <w:pPr>
         <w:rPr>
           <w:b/>
           <w:bCs/>
         </w:rPr>
-        <w:t xml:space="preserve"> Management</w:t>
-      </w:r>
-    </w:p>
-    <w:p>
-      <w:r>
-        <w:t xml:space="preserve">DEVE usare un sistema per il </w:t>
-      </w:r>
-      <w:proofErr w:type="spellStart"/>
-      <w:r>
-        <w:t>configuration</w:t>
-      </w:r>
-      <w:proofErr w:type="spellEnd"/>
-      <w:r>
-        <w:t xml:space="preserve"> management (consigliato </w:t>
-      </w:r>
-      <w:proofErr w:type="spellStart"/>
-      <w:r>
-        <w:t>github</w:t>
-      </w:r>
-      <w:proofErr w:type="spellEnd"/>
-      <w:r>
-        <w:t>) con i relativi comandi (</w:t>
-      </w:r>
-      <w:proofErr w:type="spellStart"/>
-      <w:r>
-        <w:t>git</w:t>
-      </w:r>
-      <w:proofErr w:type="spellEnd"/>
-      <w:r>
-        <w:t xml:space="preserve"> </w:t>
-      </w:r>
-      <w:proofErr w:type="spellStart"/>
-      <w:r>
-        <w:t>add</w:t>
-      </w:r>
-      <w:proofErr w:type="spellEnd"/>
-      <w:r>
-        <w:t xml:space="preserve">, </w:t>
-      </w:r>
-      <w:proofErr w:type="spellStart"/>
-      <w:r>
-        <w:t>commit</w:t>
-      </w:r>
-      <w:proofErr w:type="spellEnd"/>
-      <w:r>
-        <w:t xml:space="preserve">, </w:t>
-      </w:r>
-      <w:proofErr w:type="spellStart"/>
-      <w:r>
-        <w:t>push</w:t>
-      </w:r>
-      <w:proofErr w:type="spellEnd"/>
-      <w:r>
-        <w:t xml:space="preserve"> etc.) DEVE dimostrare di aver usato </w:t>
-      </w:r>
-      <w:proofErr w:type="spellStart"/>
-      <w:r>
-        <w:t>issuses</w:t>
-      </w:r>
-      <w:proofErr w:type="spellEnd"/>
-      <w:r>
-        <w:t xml:space="preserve">, </w:t>
-      </w:r>
-      <w:proofErr w:type="spellStart"/>
-      <w:r>
-        <w:t>branches</w:t>
-      </w:r>
-      <w:proofErr w:type="spellEnd"/>
-      <w:r>
-        <w:t xml:space="preserve">, pull </w:t>
-      </w:r>
-      <w:proofErr w:type="spellStart"/>
-      <w:r>
-        <w:t>requests</w:t>
-      </w:r>
-      <w:proofErr w:type="spellEnd"/>
-      <w:r>
-        <w:t xml:space="preserve">, e code reviews PUO’ usare la project board (tipo </w:t>
-      </w:r>
-      <w:proofErr w:type="spellStart"/>
-      <w:r>
-        <w:t>kanban</w:t>
-      </w:r>
-      <w:proofErr w:type="spellEnd"/>
-      <w:r>
-        <w:t xml:space="preserve"> o varianti simili) Documentazione: aggiungere al documento eventuali strumenti usati. Gli </w:t>
-      </w:r>
-      <w:proofErr w:type="spellStart"/>
-      <w:r>
-        <w:t>issue</w:t>
-      </w:r>
-      <w:proofErr w:type="spellEnd"/>
-      <w:r>
-        <w:t xml:space="preserve"> e l’uso di </w:t>
-      </w:r>
-      <w:proofErr w:type="spellStart"/>
-      <w:r>
-        <w:t>github</w:t>
-      </w:r>
-      <w:proofErr w:type="spellEnd"/>
-      <w:r>
-        <w:t xml:space="preserve"> è da vedere sul sito </w:t>
-      </w:r>
-      <w:proofErr w:type="spellStart"/>
-      <w:r>
-        <w:t>github</w:t>
-      </w:r>
-      <w:proofErr w:type="spellEnd"/>
-      <w:r>
-        <w:t xml:space="preserve"> (non è necessario documentarlo ma si possono portare alcune statistiche come numero di </w:t>
-      </w:r>
-      <w:proofErr w:type="spellStart"/>
-      <w:r>
-        <w:t>commit</w:t>
-      </w:r>
-      <w:proofErr w:type="spellEnd"/>
-      <w:r>
-        <w:t xml:space="preserve">, di </w:t>
-      </w:r>
-      <w:proofErr w:type="spellStart"/>
-      <w:r>
-        <w:t>issues</w:t>
-      </w:r>
-      <w:proofErr w:type="spellEnd"/>
-      <w:r>
-        <w:t xml:space="preserve"> e cose del genere).</w:t>
-      </w:r>
-    </w:p>
-    <w:p/>
+      </w:pPr>
+    </w:p>
     <w:p>
       <w:pPr>
         <w:rPr>
@@ -259,11 +299,832 @@
           <w:bCs/>
         </w:rPr>
       </w:pPr>
-      <w:r>
+    </w:p>
+    <w:p>
+      <w:pPr>
         <w:rPr>
           <w:b/>
           <w:bCs/>
         </w:rPr>
+      </w:pPr>
+    </w:p>
+    <w:p>
+      <w:pPr>
+        <w:rPr>
+          <w:b/>
+          <w:bCs/>
+        </w:rPr>
+      </w:pPr>
+    </w:p>
+    <w:p>
+      <w:pPr>
+        <w:rPr>
+          <w:b/>
+          <w:bCs/>
+        </w:rPr>
+      </w:pPr>
+    </w:p>
+    <w:p>
+      <w:pPr>
+        <w:rPr>
+          <w:b/>
+          <w:bCs/>
+        </w:rPr>
+      </w:pPr>
+    </w:p>
+    <w:p>
+      <w:pPr>
+        <w:rPr>
+          <w:b/>
+          <w:bCs/>
+        </w:rPr>
+      </w:pPr>
+    </w:p>
+    <w:p>
+      <w:pPr>
+        <w:rPr>
+          <w:b/>
+          <w:bCs/>
+        </w:rPr>
+      </w:pPr>
+    </w:p>
+    <w:p>
+      <w:pPr>
+        <w:rPr>
+          <w:b/>
+          <w:bCs/>
+        </w:rPr>
+      </w:pPr>
+    </w:p>
+    <w:p>
+      <w:pPr>
+        <w:rPr>
+          <w:b/>
+          <w:bCs/>
+        </w:rPr>
+      </w:pPr>
+    </w:p>
+    <w:p>
+      <w:pPr>
+        <w:rPr>
+          <w:b/>
+          <w:bCs/>
+        </w:rPr>
+      </w:pPr>
+    </w:p>
+    <w:p>
+      <w:pPr>
+        <w:rPr>
+          <w:b/>
+          <w:bCs/>
+        </w:rPr>
+      </w:pPr>
+    </w:p>
+    <w:p>
+      <w:pPr>
+        <w:rPr>
+          <w:b/>
+          <w:bCs/>
+        </w:rPr>
+      </w:pPr>
+    </w:p>
+    <w:p>
+      <w:pPr>
+        <w:rPr>
+          <w:b/>
+          <w:bCs/>
+        </w:rPr>
+      </w:pPr>
+    </w:p>
+    <w:p>
+      <w:pPr>
+        <w:rPr>
+          <w:b/>
+          <w:bCs/>
+        </w:rPr>
+      </w:pPr>
+    </w:p>
+    <w:p>
+      <w:pPr>
+        <w:rPr>
+          <w:b/>
+          <w:bCs/>
+        </w:rPr>
+      </w:pPr>
+    </w:p>
+    <w:p>
+      <w:pPr>
+        <w:rPr>
+          <w:b/>
+          <w:bCs/>
+        </w:rPr>
+      </w:pPr>
+    </w:p>
+    <w:p>
+      <w:pPr>
+        <w:rPr>
+          <w:b/>
+          <w:bCs/>
+        </w:rPr>
+      </w:pPr>
+    </w:p>
+    <w:p>
+      <w:pPr>
+        <w:rPr>
+          <w:b/>
+          <w:bCs/>
+        </w:rPr>
+      </w:pPr>
+    </w:p>
+    <w:p>
+      <w:pPr>
+        <w:tabs>
+          <w:tab w:val="left" w:pos="1888"/>
+        </w:tabs>
+        <w:spacing w:after="0" w:line="276" w:lineRule="auto"/>
+      </w:pPr>
+    </w:p>
+    <w:p>
+      <w:pPr>
+        <w:rPr>
+          <w:b/>
+          <w:bCs/>
+        </w:rPr>
+      </w:pPr>
+      <w:r>
+        <w:rPr>
+          <w:b/>
+          <w:bCs/>
+        </w:rPr>
+        <w:t>Configuration Management</w:t>
+      </w:r>
+    </w:p>
+    <w:p>
+      <w:r>
+        <w:t>DEVE usare un sistema per il configuration management (consigliato github) con i relativi comandi (git add, commit, push etc.) DEVE dimostrare di aver usato issuses, branches, pull requests, e code reviews PUO’ usare la project board (tipo kanban o varianti simili) Documentazione: aggiungere al documento eventuali strumenti usati. Gli issue e l’uso di github è da vedere sul sito github (non è necessario documentarlo ma si possono portare alcune statistiche come numero di commit, di issues e cose del genere).</w:t>
+      </w:r>
+    </w:p>
+    <w:p/>
+    <w:p>
+      <w:pPr>
+        <w:rPr>
+          <w:i/>
+          <w:iCs/>
+          <w:u w:val="single"/>
+        </w:rPr>
+      </w:pPr>
+      <w:r>
+        <w:rPr>
+          <w:i/>
+          <w:iCs/>
+          <w:u w:val="single"/>
+        </w:rPr>
+        <w:t>Strumenti e Workflow</w:t>
+      </w:r>
+    </w:p>
+    <w:p>
+      <w:r>
+        <w:t>Il team ha utilizzato github come gestore della configurazione.</w:t>
+      </w:r>
+    </w:p>
+    <w:p>
+      <w:r>
+        <w:t>Repository: È stata utilizzata una repository privata, accessibile ai membri del gruppo e ai professori.</w:t>
+      </w:r>
+    </w:p>
+    <w:p>
+      <w:r>
+        <w:t>Branch: sono stati creati ed utilizzati n branch, per gestire modifiche complesse o per prove su cambiamenti interni al sistema. Tutti i commit poi sono stati inseriti nel main branch, che contiene la versione stabile, corretta e finale del progetto.</w:t>
+      </w:r>
+    </w:p>
+    <w:p>
+      <w:pPr>
+        <w:rPr>
+          <w:i/>
+          <w:iCs/>
+          <w:u w:val="single"/>
+        </w:rPr>
+      </w:pPr>
+    </w:p>
+    <w:p>
+      <w:pPr>
+        <w:rPr>
+          <w:i/>
+          <w:iCs/>
+          <w:u w:val="single"/>
+        </w:rPr>
+      </w:pPr>
+      <w:r>
+        <w:rPr>
+          <w:i/>
+          <w:iCs/>
+          <w:u w:val="single"/>
+        </w:rPr>
+        <w:t>Comandi git utilizzati</w:t>
+      </w:r>
+    </w:p>
+    <w:p>
+      <w:r>
+        <w:t>Le operazioni venivano gestite tramite github desktop, questo ci permetteva di utilizzare i comandi principali senza doverli esplicitare direttamente.</w:t>
+      </w:r>
+    </w:p>
+    <w:p>
+      <w:r>
+        <w:t>Il flusso di modifica di codice era il seguente:</w:t>
+      </w:r>
+    </w:p>
+    <w:p>
+      <w:r>
+        <w:t>-Apertura github desktop</w:t>
+      </w:r>
+    </w:p>
+    <w:p>
+      <w:r>
+        <w:t xml:space="preserve">-Fetch </w:t>
+      </w:r>
+      <w:r>
+        <w:t xml:space="preserve">e pull del </w:t>
+      </w:r>
+      <w:r>
+        <w:t>progetto</w:t>
+      </w:r>
+      <w:r>
+        <w:t xml:space="preserve"> (git fetch, git pull)</w:t>
+      </w:r>
+    </w:p>
+    <w:p>
+      <w:r>
+        <w:t>-Modifiche in Eclipse e salvataggio</w:t>
+      </w:r>
+    </w:p>
+    <w:p>
+      <w:r>
+        <w:t>-</w:t>
+      </w:r>
+      <w:r>
+        <w:t>Creazione e invio commit con titolo e descrizione</w:t>
+      </w:r>
+      <w:r>
+        <w:t xml:space="preserve"> (git add, git commit -, “…”)</w:t>
+      </w:r>
+    </w:p>
+    <w:p>
+      <w:r>
+        <w:t>-Push del commit sulla repo</w:t>
+      </w:r>
+      <w:r>
+        <w:t xml:space="preserve"> (git push)</w:t>
+      </w:r>
+    </w:p>
+    <w:p/>
+    <w:p>
+      <w:pPr>
+        <w:rPr>
+          <w:i/>
+          <w:iCs/>
+          <w:u w:val="single"/>
+        </w:rPr>
+      </w:pPr>
+    </w:p>
+    <w:p>
+      <w:pPr>
+        <w:rPr>
+          <w:i/>
+          <w:iCs/>
+          <w:u w:val="single"/>
+        </w:rPr>
+      </w:pPr>
+    </w:p>
+    <w:p>
+      <w:pPr>
+        <w:rPr>
+          <w:i/>
+          <w:iCs/>
+          <w:u w:val="single"/>
+        </w:rPr>
+      </w:pPr>
+    </w:p>
+    <w:p>
+      <w:pPr>
+        <w:rPr>
+          <w:i/>
+          <w:iCs/>
+          <w:u w:val="single"/>
+        </w:rPr>
+      </w:pPr>
+    </w:p>
+    <w:p>
+      <w:pPr>
+        <w:rPr>
+          <w:i/>
+          <w:iCs/>
+          <w:u w:val="single"/>
+        </w:rPr>
+      </w:pPr>
+    </w:p>
+    <w:p>
+      <w:pPr>
+        <w:rPr>
+          <w:i/>
+          <w:iCs/>
+          <w:u w:val="single"/>
+        </w:rPr>
+      </w:pPr>
+    </w:p>
+    <w:p>
+      <w:pPr>
+        <w:rPr>
+          <w:i/>
+          <w:iCs/>
+          <w:u w:val="single"/>
+        </w:rPr>
+      </w:pPr>
+    </w:p>
+    <w:p>
+      <w:pPr>
+        <w:rPr>
+          <w:i/>
+          <w:iCs/>
+          <w:u w:val="single"/>
+        </w:rPr>
+      </w:pPr>
+    </w:p>
+    <w:p>
+      <w:pPr>
+        <w:rPr>
+          <w:i/>
+          <w:iCs/>
+          <w:u w:val="single"/>
+        </w:rPr>
+      </w:pPr>
+    </w:p>
+    <w:p>
+      <w:pPr>
+        <w:rPr>
+          <w:i/>
+          <w:iCs/>
+          <w:u w:val="single"/>
+        </w:rPr>
+      </w:pPr>
+      <w:r>
+        <w:rPr>
+          <w:i/>
+          <w:iCs/>
+          <w:u w:val="single"/>
+        </w:rPr>
+        <w:lastRenderedPageBreak/>
+        <w:t>Gestione delle attività</w:t>
+      </w:r>
+    </w:p>
+    <w:p>
+      <w:r>
+        <w:t>Per l’organizzazione del lavoro sono stati utilizzati i seguenti strumenti:</w:t>
+      </w:r>
+    </w:p>
+    <w:p>
+      <w:pPr>
+        <w:pStyle w:val="Paragrafoelenco"/>
+        <w:numPr>
+          <w:ilvl w:val="0"/>
+          <w:numId w:val="2"/>
+        </w:numPr>
+      </w:pPr>
+      <w:r>
+        <w:t>Issues: svolgevano il ruolo di product backlog. Ogni requisito mancante o bug veniva aggiunto dal membro del team (in particolare dal PO) con annessa descrizione e label</w:t>
+      </w:r>
+    </w:p>
+    <w:p>
+      <w:pPr>
+        <w:pStyle w:val="Paragrafoelenco"/>
+      </w:pPr>
+      <w:r>
+        <w:t>Qui un esempio (in data 10/10/2026):</w:t>
+      </w:r>
+    </w:p>
+    <w:p>
+      <w:pPr>
+        <w:pStyle w:val="Paragrafoelenco"/>
+      </w:pPr>
+    </w:p>
+    <w:p>
+      <w:pPr>
+        <w:pStyle w:val="Paragrafoelenco"/>
+      </w:pPr>
+      <w:r>
+        <w:drawing>
+          <wp:inline distT="0" distB="0" distL="0" distR="0" wp14:anchorId="261EBD17" wp14:editId="3F8F8C9D">
+            <wp:extent cx="5061098" cy="2903908"/>
+            <wp:effectExtent l="0" t="0" r="6350" b="0"/>
+            <wp:docPr id="1712822557" name="Immagine 1"/>
+            <wp:cNvGraphicFramePr>
+              <a:graphicFrameLocks xmlns:a="http://schemas.openxmlformats.org/drawingml/2006/main" noChangeAspect="1"/>
+            </wp:cNvGraphicFramePr>
+            <a:graphic xmlns:a="http://schemas.openxmlformats.org/drawingml/2006/main">
+              <a:graphicData uri="http://schemas.openxmlformats.org/drawingml/2006/picture">
+                <pic:pic xmlns:pic="http://schemas.openxmlformats.org/drawingml/2006/picture">
+                  <pic:nvPicPr>
+                    <pic:cNvPr id="1712822557" name=""/>
+                    <pic:cNvPicPr/>
+                  </pic:nvPicPr>
+                  <pic:blipFill>
+                    <a:blip r:embed="rId5"/>
+                    <a:stretch>
+                      <a:fillRect/>
+                    </a:stretch>
+                  </pic:blipFill>
+                  <pic:spPr>
+                    <a:xfrm>
+                      <a:off x="0" y="0"/>
+                      <a:ext cx="5088689" cy="2919739"/>
+                    </a:xfrm>
+                    <a:prstGeom prst="rect">
+                      <a:avLst/>
+                    </a:prstGeom>
+                  </pic:spPr>
+                </pic:pic>
+              </a:graphicData>
+            </a:graphic>
+          </wp:inline>
+        </w:drawing>
+      </w:r>
+    </w:p>
+    <w:p>
+      <w:pPr>
+        <w:pStyle w:val="Paragrafoelenco"/>
+      </w:pPr>
+    </w:p>
+    <w:p>
+      <w:pPr>
+        <w:pStyle w:val="Paragrafoelenco"/>
+        <w:numPr>
+          <w:ilvl w:val="0"/>
+          <w:numId w:val="2"/>
+        </w:numPr>
+      </w:pPr>
+      <w:r>
+        <w:t>Project Board: il team ha utilizzato la kanban board automatica di GitHub, messa con visibilità privata.</w:t>
+      </w:r>
+    </w:p>
+    <w:p>
+      <w:pPr>
+        <w:pStyle w:val="Paragrafoelenco"/>
+      </w:pPr>
+      <w:r>
+        <w:t>Si distinguevano 3 categorie: To Do, In Progress, Done.</w:t>
+      </w:r>
+    </w:p>
+    <w:p>
+      <w:pPr>
+        <w:pStyle w:val="Paragrafoelenco"/>
+      </w:pPr>
+      <w:r>
+        <w:t>Qui un esempio (in data 03/01/2026):</w:t>
+      </w:r>
+    </w:p>
+    <w:p>
+      <w:pPr>
+        <w:pStyle w:val="Paragrafoelenco"/>
+      </w:pPr>
+    </w:p>
+    <w:p>
+      <w:pPr>
+        <w:pStyle w:val="Paragrafoelenco"/>
+      </w:pPr>
+      <w:r>
+        <w:drawing>
+          <wp:inline distT="0" distB="0" distL="0" distR="0">
+            <wp:extent cx="5188688" cy="3414799"/>
+            <wp:effectExtent l="0" t="0" r="0" b="0"/>
+            <wp:docPr id="1866743749" name="Immagine 2"/>
+            <wp:cNvGraphicFramePr>
+              <a:graphicFrameLocks xmlns:a="http://schemas.openxmlformats.org/drawingml/2006/main" noChangeAspect="1"/>
+            </wp:cNvGraphicFramePr>
+            <a:graphic xmlns:a="http://schemas.openxmlformats.org/drawingml/2006/main">
+              <a:graphicData uri="http://schemas.openxmlformats.org/drawingml/2006/picture">
+                <pic:pic xmlns:pic="http://schemas.openxmlformats.org/drawingml/2006/picture">
+                  <pic:nvPicPr>
+                    <pic:cNvPr id="0" name="Picture 6"/>
+                    <pic:cNvPicPr>
+                      <a:picLocks noChangeAspect="1" noChangeArrowheads="1"/>
+                    </pic:cNvPicPr>
+                  </pic:nvPicPr>
+                  <pic:blipFill>
+                    <a:blip r:embed="rId6">
+                      <a:extLst>
+                        <a:ext uri="{28A0092B-C50C-407E-A947-70E740481C1C}">
+                          <a14:useLocalDpi xmlns:a14="http://schemas.microsoft.com/office/drawing/2010/main" val="0"/>
+                        </a:ext>
+                      </a:extLst>
+                    </a:blip>
+                    <a:srcRect/>
+                    <a:stretch>
+                      <a:fillRect/>
+                    </a:stretch>
+                  </pic:blipFill>
+                  <pic:spPr bwMode="auto">
+                    <a:xfrm>
+                      <a:off x="0" y="0"/>
+                      <a:ext cx="5196596" cy="3420004"/>
+                    </a:xfrm>
+                    <a:prstGeom prst="rect">
+                      <a:avLst/>
+                    </a:prstGeom>
+                    <a:noFill/>
+                    <a:ln>
+                      <a:noFill/>
+                    </a:ln>
+                  </pic:spPr>
+                </pic:pic>
+              </a:graphicData>
+            </a:graphic>
+          </wp:inline>
+        </w:drawing>
+      </w:r>
+    </w:p>
+    <w:p>
+      <w:pPr>
+        <w:tabs>
+          <w:tab w:val="left" w:pos="1155"/>
+        </w:tabs>
+      </w:pPr>
+    </w:p>
+    <w:p>
+      <w:pPr>
+        <w:tabs>
+          <w:tab w:val="left" w:pos="1888"/>
+        </w:tabs>
+        <w:spacing w:line="276" w:lineRule="auto"/>
+        <w:rPr>
+          <w:i/>
+          <w:iCs/>
+          <w:u w:val="single"/>
+        </w:rPr>
+      </w:pPr>
+      <w:r>
+        <w:rPr>
+          <w:i/>
+          <w:iCs/>
+          <w:u w:val="single"/>
+        </w:rPr>
+        <w:lastRenderedPageBreak/>
+        <w:t>Gestione delle change request</w:t>
+      </w:r>
+    </w:p>
+    <w:p>
+      <w:pPr>
+        <w:tabs>
+          <w:tab w:val="left" w:pos="1888"/>
+        </w:tabs>
+        <w:spacing w:line="276" w:lineRule="auto"/>
+      </w:pPr>
+    </w:p>
+    <w:p>
+      <w:pPr>
+        <w:pStyle w:val="Paragrafoelenco"/>
+        <w:numPr>
+          <w:ilvl w:val="0"/>
+          <w:numId w:val="1"/>
+        </w:numPr>
+        <w:tabs>
+          <w:tab w:val="left" w:pos="1888"/>
+        </w:tabs>
+        <w:spacing w:line="276" w:lineRule="auto"/>
+      </w:pPr>
+      <w:r>
+        <w:t>Modifiche minori: In caso di modifiche minori, refactoring o aggiornamenti a diagrammi o documentazione ciascun membro del gruppo di occupava di modificare il codice e verificare il suo corretto funzionamento. Il commit veniva poi effettuato direttamente sul ramo main.</w:t>
+      </w:r>
+    </w:p>
+    <w:p>
+      <w:pPr>
+        <w:pStyle w:val="Paragrafoelenco"/>
+        <w:tabs>
+          <w:tab w:val="left" w:pos="1888"/>
+        </w:tabs>
+        <w:spacing w:line="276" w:lineRule="auto"/>
+      </w:pPr>
+    </w:p>
+    <w:p>
+      <w:pPr>
+        <w:pStyle w:val="Paragrafoelenco"/>
+        <w:numPr>
+          <w:ilvl w:val="0"/>
+          <w:numId w:val="1"/>
+        </w:numPr>
+        <w:tabs>
+          <w:tab w:val="left" w:pos="1888"/>
+        </w:tabs>
+        <w:spacing w:after="0" w:line="276" w:lineRule="auto"/>
+      </w:pPr>
+      <w:r>
+        <w:t>In caso di modifiche più importanti o nuove funzionalità tracciate attraverso issue il flusso seguito era il seguente:</w:t>
+      </w:r>
+    </w:p>
+    <w:p>
+      <w:pPr>
+        <w:pStyle w:val="Paragrafoelenco"/>
+        <w:tabs>
+          <w:tab w:val="left" w:pos="1888"/>
+        </w:tabs>
+        <w:spacing w:after="0" w:line="276" w:lineRule="auto"/>
+      </w:pPr>
+      <w:r>
+        <w:t>-Apertura issue da parte del membro del gruppo (in particolare dal product owner)</w:t>
+      </w:r>
+    </w:p>
+    <w:p>
+      <w:pPr>
+        <w:pStyle w:val="Paragrafoelenco"/>
+        <w:tabs>
+          <w:tab w:val="left" w:pos="1888"/>
+        </w:tabs>
+        <w:spacing w:after="0" w:line="276" w:lineRule="auto"/>
+      </w:pPr>
+      <w:r>
+        <w:t>-Assegnazione issue o presa in carica da parte del membro del team</w:t>
+      </w:r>
+    </w:p>
+    <w:p>
+      <w:pPr>
+        <w:pStyle w:val="Paragrafoelenco"/>
+        <w:tabs>
+          <w:tab w:val="left" w:pos="1888"/>
+        </w:tabs>
+        <w:spacing w:after="0" w:line="276" w:lineRule="auto"/>
+      </w:pPr>
+      <w:r>
+        <w:t>-Apertura branch dedicato (non sempre è stato necessario)</w:t>
+      </w:r>
+    </w:p>
+    <w:p>
+      <w:pPr>
+        <w:pStyle w:val="Paragrafoelenco"/>
+        <w:tabs>
+          <w:tab w:val="left" w:pos="1888"/>
+        </w:tabs>
+        <w:spacing w:after="0" w:line="276" w:lineRule="auto"/>
+      </w:pPr>
+      <w:r>
+        <w:t>-Implementazione e test</w:t>
+      </w:r>
+    </w:p>
+    <w:p>
+      <w:pPr>
+        <w:pStyle w:val="Paragrafoelenco"/>
+        <w:tabs>
+          <w:tab w:val="left" w:pos="1888"/>
+        </w:tabs>
+        <w:spacing w:after="0" w:line="276" w:lineRule="auto"/>
+      </w:pPr>
+      <w:r>
+        <w:t xml:space="preserve">-Pull request (con eventuale descrizione) </w:t>
+      </w:r>
+    </w:p>
+    <w:p>
+      <w:pPr>
+        <w:pStyle w:val="Paragrafoelenco"/>
+        <w:tabs>
+          <w:tab w:val="left" w:pos="1888"/>
+        </w:tabs>
+        <w:spacing w:after="0" w:line="276" w:lineRule="auto"/>
+      </w:pPr>
+      <w:r>
+        <w:t>-Revisione della richiesta da parte di un altro membro e approvazione</w:t>
+      </w:r>
+    </w:p>
+    <w:p>
+      <w:pPr>
+        <w:pStyle w:val="Paragrafoelenco"/>
+        <w:tabs>
+          <w:tab w:val="left" w:pos="1888"/>
+        </w:tabs>
+        <w:spacing w:after="0" w:line="276" w:lineRule="auto"/>
+      </w:pPr>
+    </w:p>
+    <w:p>
+      <w:pPr>
+        <w:pStyle w:val="Paragrafoelenco"/>
+        <w:tabs>
+          <w:tab w:val="left" w:pos="1888"/>
+        </w:tabs>
+        <w:spacing w:after="0" w:line="276" w:lineRule="auto"/>
+      </w:pPr>
+      <w:r>
+        <w:t>Nota: questa metodologia è stata utilizzata un numero limitato di volte, data la dimensione ridotta del team e dati i frequenti meeting in cui il team verificava direttamente le modifiche esposte dal membro che aveva preso in carico la issue o il problema da risolvere. Gran parte delle revisioni sono dunque avvenute tramite revisione sincrona durante i Daily Scrum.</w:t>
+      </w:r>
+    </w:p>
+    <w:p/>
+    <w:p>
+      <w:pPr>
+        <w:rPr>
+          <w:i/>
+          <w:iCs/>
+          <w:u w:val="single"/>
+        </w:rPr>
+      </w:pPr>
+      <w:r>
+        <w:rPr>
+          <w:i/>
+          <w:iCs/>
+          <w:u w:val="single"/>
+        </w:rPr>
+        <w:t>Statistiche della repo</w:t>
+      </w:r>
+      <w:r>
+        <w:rPr>
+          <w:i/>
+          <w:iCs/>
+          <w:u w:val="single"/>
+        </w:rPr>
+        <w:t xml:space="preserve"> (al 10/01/2026)</w:t>
+      </w:r>
+    </w:p>
+    <w:p>
+      <w:pPr>
+        <w:pStyle w:val="Paragrafoelenco"/>
+        <w:numPr>
+          <w:ilvl w:val="0"/>
+          <w:numId w:val="3"/>
+        </w:numPr>
+      </w:pPr>
+      <w:r>
+        <w:t>Numero totale di commit: 236</w:t>
+      </w:r>
+    </w:p>
+    <w:p>
+      <w:pPr>
+        <w:pStyle w:val="Paragrafoelenco"/>
+      </w:pPr>
+    </w:p>
+    <w:p>
+      <w:pPr>
+        <w:pStyle w:val="Paragrafoelenco"/>
+        <w:numPr>
+          <w:ilvl w:val="0"/>
+          <w:numId w:val="3"/>
+        </w:numPr>
+      </w:pPr>
+      <w:r>
+        <w:t>Numero di issue gestite: 34</w:t>
+      </w:r>
+    </w:p>
+    <w:p>
+      <w:pPr>
+        <w:pStyle w:val="Paragrafoelenco"/>
+      </w:pPr>
+    </w:p>
+    <w:p>
+      <w:pPr>
+        <w:pStyle w:val="Paragrafoelenco"/>
+        <w:numPr>
+          <w:ilvl w:val="0"/>
+          <w:numId w:val="3"/>
+        </w:numPr>
+      </w:pPr>
+      <w:r>
+        <w:t xml:space="preserve">Numero di pull request: 5 </w:t>
+      </w:r>
+    </w:p>
+    <w:p>
+      <w:pPr>
+        <w:pStyle w:val="Paragrafoelenco"/>
+      </w:pPr>
+    </w:p>
+    <w:p>
+      <w:pPr>
+        <w:pStyle w:val="Paragrafoelenco"/>
+        <w:numPr>
+          <w:ilvl w:val="0"/>
+          <w:numId w:val="3"/>
+        </w:numPr>
+      </w:pPr>
+      <w:r>
+        <w:t>Contributors: 4 (ciascuno con il proprio ruolo)</w:t>
+      </w:r>
+    </w:p>
+    <w:p/>
+    <w:p/>
+    <w:p/>
+    <w:p/>
+    <w:p/>
+    <w:p/>
+    <w:p/>
+    <w:p/>
+    <w:p/>
+    <w:p/>
+    <w:p/>
+    <w:p>
+      <w:pPr>
+        <w:rPr>
+          <w:b/>
+          <w:bCs/>
+        </w:rPr>
+      </w:pPr>
+      <w:r>
+        <w:rPr>
+          <w:b/>
+          <w:bCs/>
+        </w:rPr>
+        <w:lastRenderedPageBreak/>
         <w:t>People Management and Team Organization</w:t>
       </w:r>
     </w:p>
@@ -273,6 +1134,630 @@
       </w:r>
     </w:p>
     <w:p/>
+    <w:p>
+      <w:pPr>
+        <w:rPr>
+          <w:i/>
+          <w:iCs/>
+          <w:u w:val="single"/>
+        </w:rPr>
+      </w:pPr>
+      <w:r>
+        <w:rPr>
+          <w:i/>
+          <w:iCs/>
+          <w:u w:val="single"/>
+        </w:rPr>
+        <w:t xml:space="preserve">Ruoli </w:t>
+      </w:r>
+    </w:p>
+    <w:tbl>
+      <w:tblPr>
+        <w:tblStyle w:val="Grigliatabellachiara"/>
+        <w:tblW w:w="0" w:type="auto"/>
+        <w:tblLook w:val="04A0" w:firstRow="1" w:lastRow="0" w:firstColumn="1" w:lastColumn="0" w:noHBand="0" w:noVBand="1"/>
+      </w:tblPr>
+      <w:tblGrid>
+        <w:gridCol w:w="2076"/>
+        <w:gridCol w:w="1988"/>
+        <w:gridCol w:w="3868"/>
+      </w:tblGrid>
+      <w:tr>
+        <w:tc>
+          <w:tcPr>
+            <w:tcW w:w="0" w:type="auto"/>
+            <w:hideMark/>
+          </w:tcPr>
+          <w:p>
+            <w:pPr>
+              <w:spacing w:after="160" w:line="259" w:lineRule="auto"/>
+            </w:pPr>
+            <w:r>
+              <w:rPr>
+                <w:b/>
+                <w:bCs/>
+              </w:rPr>
+              <w:t>Membro del Team</w:t>
+            </w:r>
+          </w:p>
+        </w:tc>
+        <w:tc>
+          <w:tcPr>
+            <w:tcW w:w="0" w:type="auto"/>
+            <w:hideMark/>
+          </w:tcPr>
+          <w:p>
+            <w:pPr>
+              <w:spacing w:after="160" w:line="259" w:lineRule="auto"/>
+            </w:pPr>
+            <w:r>
+              <w:rPr>
+                <w:b/>
+                <w:bCs/>
+              </w:rPr>
+              <w:t>Ruolo Scrum</w:t>
+            </w:r>
+          </w:p>
+        </w:tc>
+        <w:tc>
+          <w:tcPr>
+            <w:tcW w:w="0" w:type="auto"/>
+            <w:hideMark/>
+          </w:tcPr>
+          <w:p>
+            <w:pPr>
+              <w:spacing w:after="160" w:line="259" w:lineRule="auto"/>
+            </w:pPr>
+            <w:r>
+              <w:rPr>
+                <w:b/>
+                <w:bCs/>
+              </w:rPr>
+              <w:t>Responsabilità e Competenze Specifiche</w:t>
+            </w:r>
+          </w:p>
+        </w:tc>
+      </w:tr>
+      <w:tr>
+        <w:tc>
+          <w:tcPr>
+            <w:tcW w:w="0" w:type="auto"/>
+            <w:hideMark/>
+          </w:tcPr>
+          <w:p>
+            <w:pPr>
+              <w:spacing w:after="160" w:line="259" w:lineRule="auto"/>
+              <w:jc w:val="center"/>
+              <w:rPr>
+                <w:b/>
+                <w:bCs/>
+              </w:rPr>
+            </w:pPr>
+          </w:p>
+          <w:p>
+            <w:pPr>
+              <w:spacing w:after="160" w:line="259" w:lineRule="auto"/>
+              <w:jc w:val="center"/>
+              <w:rPr>
+                <w:b/>
+                <w:bCs/>
+              </w:rPr>
+            </w:pPr>
+            <w:r>
+              <w:rPr>
+                <w:b/>
+                <w:bCs/>
+              </w:rPr>
+              <w:t>Davide Mascheretti</w:t>
+            </w:r>
+          </w:p>
+          <w:p>
+            <w:pPr>
+              <w:spacing w:after="160" w:line="259" w:lineRule="auto"/>
+              <w:jc w:val="center"/>
+              <w:rPr>
+                <w:b/>
+                <w:bCs/>
+              </w:rPr>
+            </w:pPr>
+          </w:p>
+          <w:p>
+            <w:pPr>
+              <w:spacing w:after="160" w:line="259" w:lineRule="auto"/>
+              <w:jc w:val="center"/>
+            </w:pPr>
+          </w:p>
+        </w:tc>
+        <w:tc>
+          <w:tcPr>
+            <w:tcW w:w="0" w:type="auto"/>
+            <w:hideMark/>
+          </w:tcPr>
+          <w:p>
+            <w:pPr>
+              <w:spacing w:after="160" w:line="259" w:lineRule="auto"/>
+              <w:jc w:val="center"/>
+              <w:rPr>
+                <w:b/>
+                <w:bCs/>
+              </w:rPr>
+            </w:pPr>
+          </w:p>
+          <w:p>
+            <w:pPr>
+              <w:spacing w:after="160" w:line="259" w:lineRule="auto"/>
+              <w:jc w:val="center"/>
+            </w:pPr>
+            <w:r>
+              <w:rPr>
+                <w:b/>
+                <w:bCs/>
+              </w:rPr>
+              <w:t>Product Owner</w:t>
+            </w:r>
+          </w:p>
+        </w:tc>
+        <w:tc>
+          <w:tcPr>
+            <w:tcW w:w="0" w:type="auto"/>
+            <w:hideMark/>
+          </w:tcPr>
+          <w:p>
+            <w:pPr>
+              <w:spacing w:after="160" w:line="259" w:lineRule="auto"/>
+              <w:jc w:val="center"/>
+              <w:rPr>
+                <w:b/>
+                <w:bCs/>
+              </w:rPr>
+            </w:pPr>
+          </w:p>
+          <w:p>
+            <w:pPr>
+              <w:spacing w:after="160" w:line="259" w:lineRule="auto"/>
+              <w:jc w:val="center"/>
+              <w:rPr>
+                <w:b/>
+                <w:bCs/>
+              </w:rPr>
+            </w:pPr>
+            <w:r>
+              <w:rPr>
+                <w:b/>
+                <w:bCs/>
+              </w:rPr>
+              <w:t>Backend Developer</w:t>
+            </w:r>
+          </w:p>
+          <w:p>
+            <w:pPr>
+              <w:spacing w:after="160" w:line="259" w:lineRule="auto"/>
+              <w:jc w:val="center"/>
+            </w:pPr>
+          </w:p>
+        </w:tc>
+      </w:tr>
+      <w:tr>
+        <w:tc>
+          <w:tcPr>
+            <w:tcW w:w="0" w:type="auto"/>
+            <w:hideMark/>
+          </w:tcPr>
+          <w:p>
+            <w:pPr>
+              <w:spacing w:after="160" w:line="259" w:lineRule="auto"/>
+              <w:jc w:val="center"/>
+              <w:rPr>
+                <w:b/>
+                <w:bCs/>
+              </w:rPr>
+            </w:pPr>
+          </w:p>
+          <w:p>
+            <w:pPr>
+              <w:spacing w:after="160" w:line="259" w:lineRule="auto"/>
+              <w:jc w:val="center"/>
+              <w:rPr>
+                <w:b/>
+                <w:bCs/>
+              </w:rPr>
+            </w:pPr>
+            <w:r>
+              <w:rPr>
+                <w:b/>
+                <w:bCs/>
+              </w:rPr>
+              <w:t>Tommaso Maistrello</w:t>
+            </w:r>
+          </w:p>
+          <w:p>
+            <w:pPr>
+              <w:spacing w:after="160" w:line="259" w:lineRule="auto"/>
+              <w:jc w:val="center"/>
+              <w:rPr>
+                <w:b/>
+                <w:bCs/>
+              </w:rPr>
+            </w:pPr>
+          </w:p>
+          <w:p>
+            <w:pPr>
+              <w:spacing w:after="160" w:line="259" w:lineRule="auto"/>
+              <w:jc w:val="center"/>
+            </w:pPr>
+          </w:p>
+        </w:tc>
+        <w:tc>
+          <w:tcPr>
+            <w:tcW w:w="0" w:type="auto"/>
+            <w:hideMark/>
+          </w:tcPr>
+          <w:p>
+            <w:pPr>
+              <w:spacing w:after="160" w:line="259" w:lineRule="auto"/>
+              <w:jc w:val="center"/>
+              <w:rPr>
+                <w:b/>
+                <w:bCs/>
+              </w:rPr>
+            </w:pPr>
+          </w:p>
+          <w:p>
+            <w:pPr>
+              <w:spacing w:after="160" w:line="259" w:lineRule="auto"/>
+              <w:jc w:val="center"/>
+            </w:pPr>
+            <w:r>
+              <w:rPr>
+                <w:b/>
+                <w:bCs/>
+              </w:rPr>
+              <w:t>Scrum Master</w:t>
+            </w:r>
+          </w:p>
+        </w:tc>
+        <w:tc>
+          <w:tcPr>
+            <w:tcW w:w="0" w:type="auto"/>
+            <w:hideMark/>
+          </w:tcPr>
+          <w:p>
+            <w:pPr>
+              <w:spacing w:after="160" w:line="259" w:lineRule="auto"/>
+              <w:jc w:val="center"/>
+              <w:rPr>
+                <w:b/>
+                <w:bCs/>
+              </w:rPr>
+            </w:pPr>
+          </w:p>
+          <w:p>
+            <w:pPr>
+              <w:spacing w:after="160" w:line="259" w:lineRule="auto"/>
+              <w:jc w:val="center"/>
+            </w:pPr>
+            <w:r>
+              <w:rPr>
+                <w:b/>
+                <w:bCs/>
+              </w:rPr>
+              <w:t>Frontend Developer</w:t>
+            </w:r>
+          </w:p>
+        </w:tc>
+      </w:tr>
+      <w:tr>
+        <w:tc>
+          <w:tcPr>
+            <w:tcW w:w="0" w:type="auto"/>
+            <w:hideMark/>
+          </w:tcPr>
+          <w:p>
+            <w:pPr>
+              <w:spacing w:after="160" w:line="259" w:lineRule="auto"/>
+              <w:jc w:val="center"/>
+              <w:rPr>
+                <w:b/>
+                <w:bCs/>
+              </w:rPr>
+            </w:pPr>
+          </w:p>
+          <w:p>
+            <w:pPr>
+              <w:spacing w:after="160" w:line="259" w:lineRule="auto"/>
+              <w:jc w:val="center"/>
+              <w:rPr>
+                <w:b/>
+                <w:bCs/>
+              </w:rPr>
+            </w:pPr>
+            <w:r>
+              <w:rPr>
+                <w:b/>
+                <w:bCs/>
+              </w:rPr>
+              <w:t>Francesco Valenari</w:t>
+            </w:r>
+          </w:p>
+          <w:p>
+            <w:pPr>
+              <w:spacing w:after="160" w:line="259" w:lineRule="auto"/>
+              <w:jc w:val="center"/>
+              <w:rPr>
+                <w:b/>
+                <w:bCs/>
+              </w:rPr>
+            </w:pPr>
+          </w:p>
+          <w:p>
+            <w:pPr>
+              <w:spacing w:after="160" w:line="259" w:lineRule="auto"/>
+              <w:jc w:val="center"/>
+            </w:pPr>
+          </w:p>
+        </w:tc>
+        <w:tc>
+          <w:tcPr>
+            <w:tcW w:w="0" w:type="auto"/>
+            <w:hideMark/>
+          </w:tcPr>
+          <w:p>
+            <w:pPr>
+              <w:spacing w:after="160" w:line="259" w:lineRule="auto"/>
+              <w:jc w:val="center"/>
+              <w:rPr>
+                <w:b/>
+                <w:bCs/>
+              </w:rPr>
+            </w:pPr>
+          </w:p>
+          <w:p>
+            <w:pPr>
+              <w:spacing w:after="160" w:line="259" w:lineRule="auto"/>
+              <w:jc w:val="center"/>
+            </w:pPr>
+            <w:r>
+              <w:rPr>
+                <w:b/>
+                <w:bCs/>
+              </w:rPr>
+              <w:t>Development Team</w:t>
+            </w:r>
+          </w:p>
+        </w:tc>
+        <w:tc>
+          <w:tcPr>
+            <w:tcW w:w="0" w:type="auto"/>
+            <w:hideMark/>
+          </w:tcPr>
+          <w:p>
+            <w:pPr>
+              <w:spacing w:after="160" w:line="259" w:lineRule="auto"/>
+              <w:jc w:val="center"/>
+              <w:rPr>
+                <w:b/>
+                <w:bCs/>
+              </w:rPr>
+            </w:pPr>
+          </w:p>
+          <w:p>
+            <w:pPr>
+              <w:spacing w:after="160" w:line="259" w:lineRule="auto"/>
+              <w:jc w:val="center"/>
+            </w:pPr>
+            <w:r>
+              <w:rPr>
+                <w:b/>
+                <w:bCs/>
+              </w:rPr>
+              <w:t>Frontend</w:t>
+            </w:r>
+          </w:p>
+          <w:p>
+            <w:pPr>
+              <w:spacing w:after="160" w:line="259" w:lineRule="auto"/>
+              <w:jc w:val="center"/>
+            </w:pPr>
+          </w:p>
+        </w:tc>
+      </w:tr>
+      <w:tr>
+        <w:tc>
+          <w:tcPr>
+            <w:tcW w:w="0" w:type="auto"/>
+            <w:hideMark/>
+          </w:tcPr>
+          <w:p>
+            <w:pPr>
+              <w:spacing w:after="160" w:line="259" w:lineRule="auto"/>
+              <w:jc w:val="center"/>
+              <w:rPr>
+                <w:b/>
+                <w:bCs/>
+              </w:rPr>
+            </w:pPr>
+          </w:p>
+          <w:p>
+            <w:pPr>
+              <w:spacing w:after="160" w:line="259" w:lineRule="auto"/>
+              <w:jc w:val="center"/>
+              <w:rPr>
+                <w:b/>
+                <w:bCs/>
+              </w:rPr>
+            </w:pPr>
+            <w:r>
+              <w:rPr>
+                <w:b/>
+                <w:bCs/>
+              </w:rPr>
+              <w:t>Claudio Morgera</w:t>
+            </w:r>
+          </w:p>
+          <w:p>
+            <w:pPr>
+              <w:spacing w:after="160" w:line="259" w:lineRule="auto"/>
+              <w:jc w:val="center"/>
+              <w:rPr>
+                <w:b/>
+                <w:bCs/>
+              </w:rPr>
+            </w:pPr>
+          </w:p>
+          <w:p>
+            <w:pPr>
+              <w:spacing w:after="160" w:line="259" w:lineRule="auto"/>
+              <w:jc w:val="center"/>
+            </w:pPr>
+          </w:p>
+        </w:tc>
+        <w:tc>
+          <w:tcPr>
+            <w:tcW w:w="0" w:type="auto"/>
+            <w:hideMark/>
+          </w:tcPr>
+          <w:p>
+            <w:pPr>
+              <w:spacing w:after="160" w:line="259" w:lineRule="auto"/>
+              <w:jc w:val="center"/>
+              <w:rPr>
+                <w:b/>
+                <w:bCs/>
+              </w:rPr>
+            </w:pPr>
+          </w:p>
+          <w:p>
+            <w:pPr>
+              <w:spacing w:after="160" w:line="259" w:lineRule="auto"/>
+              <w:jc w:val="center"/>
+            </w:pPr>
+            <w:r>
+              <w:rPr>
+                <w:b/>
+                <w:bCs/>
+              </w:rPr>
+              <w:t>Development Team</w:t>
+            </w:r>
+          </w:p>
+        </w:tc>
+        <w:tc>
+          <w:tcPr>
+            <w:tcW w:w="0" w:type="auto"/>
+            <w:hideMark/>
+          </w:tcPr>
+          <w:p>
+            <w:pPr>
+              <w:spacing w:after="160" w:line="259" w:lineRule="auto"/>
+              <w:jc w:val="center"/>
+              <w:rPr>
+                <w:b/>
+                <w:bCs/>
+              </w:rPr>
+            </w:pPr>
+          </w:p>
+          <w:p>
+            <w:pPr>
+              <w:spacing w:after="160" w:line="259" w:lineRule="auto"/>
+              <w:jc w:val="center"/>
+            </w:pPr>
+            <w:r>
+              <w:rPr>
+                <w:b/>
+                <w:bCs/>
+              </w:rPr>
+              <w:t>Backend</w:t>
+            </w:r>
+          </w:p>
+        </w:tc>
+      </w:tr>
+    </w:tbl>
+    <w:p/>
+    <w:p/>
+    <w:p>
+      <w:pPr>
+        <w:rPr>
+          <w:i/>
+          <w:iCs/>
+          <w:u w:val="single"/>
+        </w:rPr>
+      </w:pPr>
+      <w:r>
+        <w:rPr>
+          <w:i/>
+          <w:iCs/>
+          <w:u w:val="single"/>
+        </w:rPr>
+        <w:t>Comunicazione</w:t>
+      </w:r>
+    </w:p>
+    <w:p>
+      <w:r>
+        <w:t>La comunicazione nel team è avvenuta attraverso differenti metodi</w:t>
+      </w:r>
+    </w:p>
+    <w:p>
+      <w:pPr>
+        <w:pStyle w:val="Paragrafoelenco"/>
+        <w:numPr>
+          <w:ilvl w:val="0"/>
+          <w:numId w:val="5"/>
+        </w:numPr>
+      </w:pPr>
+      <w:r>
+        <w:t>In presenza, per planning e review</w:t>
+      </w:r>
+    </w:p>
+    <w:p>
+      <w:pPr>
+        <w:pStyle w:val="Paragrafoelenco"/>
+      </w:pPr>
+    </w:p>
+    <w:p>
+      <w:pPr>
+        <w:pStyle w:val="Paragrafoelenco"/>
+        <w:numPr>
+          <w:ilvl w:val="0"/>
+          <w:numId w:val="5"/>
+        </w:numPr>
+      </w:pPr>
+      <w:r>
+        <w:t>In presenza/tramite messaggistica: Daily Scrum</w:t>
+      </w:r>
+    </w:p>
+    <w:p>
+      <w:pPr>
+        <w:pStyle w:val="Paragrafoelenco"/>
+      </w:pPr>
+    </w:p>
+    <w:p>
+      <w:pPr>
+        <w:pStyle w:val="Paragrafoelenco"/>
+        <w:numPr>
+          <w:ilvl w:val="0"/>
+          <w:numId w:val="5"/>
+        </w:numPr>
+      </w:pPr>
+      <w:r>
+        <w:t xml:space="preserve">Whatsapp: comunicazione giornaliera rapida  </w:t>
+      </w:r>
+    </w:p>
+    <w:p>
+      <w:pPr>
+        <w:pStyle w:val="Paragrafoelenco"/>
+      </w:pPr>
+    </w:p>
+    <w:p>
+      <w:pPr>
+        <w:pStyle w:val="Paragrafoelenco"/>
+        <w:numPr>
+          <w:ilvl w:val="0"/>
+          <w:numId w:val="5"/>
+        </w:numPr>
+      </w:pPr>
+      <w:r>
+        <w:t>Github: documentazione, issues  e commenti</w:t>
+      </w:r>
+    </w:p>
     <w:sectPr>
       <w:pgSz w:w="11906" w:h="16838"/>
       <w:pgMar w:top="1417" w:right="1134" w:bottom="1134" w:left="1134" w:header="708" w:footer="708" w:gutter="0"/>
@@ -281,6 +1766,495 @@
     </w:sectPr>
   </w:body>
 </w:document>
+</file>
+
+<file path=word/numbering.xml><?xml version="1.0" encoding="utf-8"?>
+<w:numbering xmlns:wpc="http://schemas.microsoft.com/office/word/2010/wordprocessingCanvas" xmlns:cx="http://schemas.microsoft.com/office/drawing/2014/chartex" xmlns:cx1="http://schemas.microsoft.com/office/drawing/2015/9/8/chartex" xmlns:cx2="http://schemas.microsoft.com/office/drawing/2015/10/21/chartex" xmlns:cx3="http://schemas.microsoft.com/office/drawing/2016/5/9/chartex" xmlns:cx4="http://schemas.microsoft.com/office/drawing/2016/5/10/chartex" xmlns:cx5="http://schemas.microsoft.com/office/drawing/2016/5/11/chartex" xmlns:cx6="http://schemas.microsoft.com/office/drawing/2016/5/12/chartex" xmlns:cx7="http://schemas.microsoft.com/office/drawing/2016/5/13/chartex" xmlns:cx8="http://schemas.microsoft.com/office/drawing/2016/5/14/chartex" xmlns:mc="http://schemas.openxmlformats.org/markup-compatibility/2006" xmlns:aink="http://schemas.microsoft.com/office/drawing/2016/ink" xmlns:am3d="http://schemas.microsoft.com/office/drawing/2017/model3d" xmlns:o="urn:schemas-microsoft-com:office:office" xmlns:oel="http://schemas.microsoft.com/office/2019/extlst" xmlns:r="http://schemas.openxmlformats.org/officeDocument/2006/relationships" xmlns:m="http://schemas.openxmlformats.org/officeDocument/2006/math" xmlns:v="urn:schemas-microsoft-com:vml" xmlns:wp14="http://schemas.microsoft.com/office/word/2010/wordprocessingDrawing" xmlns:wp="http://schemas.openxmlformats.org/drawingml/2006/wordprocessingDrawing" xmlns:w10="urn:schemas-microsoft-com:office:word" xmlns:w="http://schemas.openxmlformats.org/wordprocessingml/2006/main" xmlns:w14="http://schemas.microsoft.com/office/word/2010/wordml" xmlns:w15="http://schemas.microsoft.com/office/word/2012/wordml" xmlns:w16cex="http://schemas.microsoft.com/office/word/2018/wordml/cex" xmlns:w16cid="http://schemas.microsoft.com/office/word/2016/wordml/cid" xmlns:w16="http://schemas.microsoft.com/office/word/2018/wordml" xmlns:w16du="http://schemas.microsoft.com/office/word/2023/wordml/word16du" xmlns:w16sdtdh="http://schemas.microsoft.com/office/word/2020/wordml/sdtdatahash" xmlns:w16sdtfl="http://schemas.microsoft.com/office/word/2024/wordml/sdtformatlock" xmlns:w16se="http://schemas.microsoft.com/office/word/2015/wordml/symex" xmlns:wpg="http://schemas.microsoft.com/office/word/2010/wordprocessingGroup" xmlns:wpi="http://schemas.microsoft.com/office/word/2010/wordprocessingInk" xmlns:wne="http://schemas.microsoft.com/office/word/2006/wordml" xmlns:wps="http://schemas.microsoft.com/office/word/2010/wordprocessingShape" mc:Ignorable="w14 w15 w16se w16cid w16 w16cex w16sdtdh w16sdtfl w16du wp14">
+  <w:abstractNum w:abstractNumId="0" w15:restartNumberingAfterBreak="0">
+    <w:nsid w:val="0E7258FD"/>
+    <w:multiLevelType w:val="hybridMultilevel"/>
+    <w:tmpl w:val="DD243B98"/>
+    <w:lvl w:ilvl="0" w:tplc="AADAF208">
+      <w:start w:val="1"/>
+      <w:numFmt w:val="decimal"/>
+      <w:lvlText w:val="%1-"/>
+      <w:lvlJc w:val="left"/>
+      <w:pPr>
+        <w:ind w:left="720" w:hanging="360"/>
+      </w:pPr>
+      <w:rPr>
+        <w:rFonts w:hint="default"/>
+      </w:rPr>
+    </w:lvl>
+    <w:lvl w:ilvl="1" w:tplc="04100019" w:tentative="1">
+      <w:start w:val="1"/>
+      <w:numFmt w:val="lowerLetter"/>
+      <w:lvlText w:val="%2."/>
+      <w:lvlJc w:val="left"/>
+      <w:pPr>
+        <w:ind w:left="1440" w:hanging="360"/>
+      </w:pPr>
+    </w:lvl>
+    <w:lvl w:ilvl="2" w:tplc="0410001B" w:tentative="1">
+      <w:start w:val="1"/>
+      <w:numFmt w:val="lowerRoman"/>
+      <w:lvlText w:val="%3."/>
+      <w:lvlJc w:val="right"/>
+      <w:pPr>
+        <w:ind w:left="2160" w:hanging="180"/>
+      </w:pPr>
+    </w:lvl>
+    <w:lvl w:ilvl="3" w:tplc="0410000F" w:tentative="1">
+      <w:start w:val="1"/>
+      <w:numFmt w:val="decimal"/>
+      <w:lvlText w:val="%4."/>
+      <w:lvlJc w:val="left"/>
+      <w:pPr>
+        <w:ind w:left="2880" w:hanging="360"/>
+      </w:pPr>
+    </w:lvl>
+    <w:lvl w:ilvl="4" w:tplc="04100019" w:tentative="1">
+      <w:start w:val="1"/>
+      <w:numFmt w:val="lowerLetter"/>
+      <w:lvlText w:val="%5."/>
+      <w:lvlJc w:val="left"/>
+      <w:pPr>
+        <w:ind w:left="3600" w:hanging="360"/>
+      </w:pPr>
+    </w:lvl>
+    <w:lvl w:ilvl="5" w:tplc="0410001B" w:tentative="1">
+      <w:start w:val="1"/>
+      <w:numFmt w:val="lowerRoman"/>
+      <w:lvlText w:val="%6."/>
+      <w:lvlJc w:val="right"/>
+      <w:pPr>
+        <w:ind w:left="4320" w:hanging="180"/>
+      </w:pPr>
+    </w:lvl>
+    <w:lvl w:ilvl="6" w:tplc="0410000F" w:tentative="1">
+      <w:start w:val="1"/>
+      <w:numFmt w:val="decimal"/>
+      <w:lvlText w:val="%7."/>
+      <w:lvlJc w:val="left"/>
+      <w:pPr>
+        <w:ind w:left="5040" w:hanging="360"/>
+      </w:pPr>
+    </w:lvl>
+    <w:lvl w:ilvl="7" w:tplc="04100019" w:tentative="1">
+      <w:start w:val="1"/>
+      <w:numFmt w:val="lowerLetter"/>
+      <w:lvlText w:val="%8."/>
+      <w:lvlJc w:val="left"/>
+      <w:pPr>
+        <w:ind w:left="5760" w:hanging="360"/>
+      </w:pPr>
+    </w:lvl>
+    <w:lvl w:ilvl="8" w:tplc="0410001B" w:tentative="1">
+      <w:start w:val="1"/>
+      <w:numFmt w:val="lowerRoman"/>
+      <w:lvlText w:val="%9."/>
+      <w:lvlJc w:val="right"/>
+      <w:pPr>
+        <w:ind w:left="6480" w:hanging="180"/>
+      </w:pPr>
+    </w:lvl>
+  </w:abstractNum>
+  <w:abstractNum w:abstractNumId="1" w15:restartNumberingAfterBreak="0">
+    <w:nsid w:val="19632643"/>
+    <w:multiLevelType w:val="hybridMultilevel"/>
+    <w:tmpl w:val="E068B3C2"/>
+    <w:lvl w:ilvl="0" w:tplc="750A7E8A">
+      <w:start w:val="1"/>
+      <w:numFmt w:val="decimal"/>
+      <w:lvlText w:val="%1-"/>
+      <w:lvlJc w:val="left"/>
+      <w:pPr>
+        <w:ind w:left="720" w:hanging="360"/>
+      </w:pPr>
+      <w:rPr>
+        <w:rFonts w:hint="default"/>
+      </w:rPr>
+    </w:lvl>
+    <w:lvl w:ilvl="1" w:tplc="04100019" w:tentative="1">
+      <w:start w:val="1"/>
+      <w:numFmt w:val="lowerLetter"/>
+      <w:lvlText w:val="%2."/>
+      <w:lvlJc w:val="left"/>
+      <w:pPr>
+        <w:ind w:left="1440" w:hanging="360"/>
+      </w:pPr>
+    </w:lvl>
+    <w:lvl w:ilvl="2" w:tplc="0410001B" w:tentative="1">
+      <w:start w:val="1"/>
+      <w:numFmt w:val="lowerRoman"/>
+      <w:lvlText w:val="%3."/>
+      <w:lvlJc w:val="right"/>
+      <w:pPr>
+        <w:ind w:left="2160" w:hanging="180"/>
+      </w:pPr>
+    </w:lvl>
+    <w:lvl w:ilvl="3" w:tplc="0410000F" w:tentative="1">
+      <w:start w:val="1"/>
+      <w:numFmt w:val="decimal"/>
+      <w:lvlText w:val="%4."/>
+      <w:lvlJc w:val="left"/>
+      <w:pPr>
+        <w:ind w:left="2880" w:hanging="360"/>
+      </w:pPr>
+    </w:lvl>
+    <w:lvl w:ilvl="4" w:tplc="04100019" w:tentative="1">
+      <w:start w:val="1"/>
+      <w:numFmt w:val="lowerLetter"/>
+      <w:lvlText w:val="%5."/>
+      <w:lvlJc w:val="left"/>
+      <w:pPr>
+        <w:ind w:left="3600" w:hanging="360"/>
+      </w:pPr>
+    </w:lvl>
+    <w:lvl w:ilvl="5" w:tplc="0410001B" w:tentative="1">
+      <w:start w:val="1"/>
+      <w:numFmt w:val="lowerRoman"/>
+      <w:lvlText w:val="%6."/>
+      <w:lvlJc w:val="right"/>
+      <w:pPr>
+        <w:ind w:left="4320" w:hanging="180"/>
+      </w:pPr>
+    </w:lvl>
+    <w:lvl w:ilvl="6" w:tplc="0410000F" w:tentative="1">
+      <w:start w:val="1"/>
+      <w:numFmt w:val="decimal"/>
+      <w:lvlText w:val="%7."/>
+      <w:lvlJc w:val="left"/>
+      <w:pPr>
+        <w:ind w:left="5040" w:hanging="360"/>
+      </w:pPr>
+    </w:lvl>
+    <w:lvl w:ilvl="7" w:tplc="04100019" w:tentative="1">
+      <w:start w:val="1"/>
+      <w:numFmt w:val="lowerLetter"/>
+      <w:lvlText w:val="%8."/>
+      <w:lvlJc w:val="left"/>
+      <w:pPr>
+        <w:ind w:left="5760" w:hanging="360"/>
+      </w:pPr>
+    </w:lvl>
+    <w:lvl w:ilvl="8" w:tplc="0410001B" w:tentative="1">
+      <w:start w:val="1"/>
+      <w:numFmt w:val="lowerRoman"/>
+      <w:lvlText w:val="%9."/>
+      <w:lvlJc w:val="right"/>
+      <w:pPr>
+        <w:ind w:left="6480" w:hanging="180"/>
+      </w:pPr>
+    </w:lvl>
+  </w:abstractNum>
+  <w:abstractNum w:abstractNumId="2" w15:restartNumberingAfterBreak="0">
+    <w:nsid w:val="1FEE260E"/>
+    <w:multiLevelType w:val="hybridMultilevel"/>
+    <w:tmpl w:val="41B6360E"/>
+    <w:lvl w:ilvl="0" w:tplc="08D63A9E">
+      <w:start w:val="1"/>
+      <w:numFmt w:val="bullet"/>
+      <w:lvlText w:val="-"/>
+      <w:lvlJc w:val="left"/>
+      <w:pPr>
+        <w:ind w:left="1068" w:hanging="360"/>
+      </w:pPr>
+      <w:rPr>
+        <w:rFonts w:ascii="Calibri" w:eastAsiaTheme="minorHAnsi" w:hAnsi="Calibri" w:cs="Calibri" w:hint="default"/>
+      </w:rPr>
+    </w:lvl>
+    <w:lvl w:ilvl="1" w:tplc="04100003" w:tentative="1">
+      <w:start w:val="1"/>
+      <w:numFmt w:val="bullet"/>
+      <w:lvlText w:val="o"/>
+      <w:lvlJc w:val="left"/>
+      <w:pPr>
+        <w:ind w:left="1788" w:hanging="360"/>
+      </w:pPr>
+      <w:rPr>
+        <w:rFonts w:ascii="Courier New" w:hAnsi="Courier New" w:cs="Courier New" w:hint="default"/>
+      </w:rPr>
+    </w:lvl>
+    <w:lvl w:ilvl="2" w:tplc="04100005" w:tentative="1">
+      <w:start w:val="1"/>
+      <w:numFmt w:val="bullet"/>
+      <w:lvlText w:val=""/>
+      <w:lvlJc w:val="left"/>
+      <w:pPr>
+        <w:ind w:left="2508" w:hanging="360"/>
+      </w:pPr>
+      <w:rPr>
+        <w:rFonts w:ascii="Wingdings" w:hAnsi="Wingdings" w:hint="default"/>
+      </w:rPr>
+    </w:lvl>
+    <w:lvl w:ilvl="3" w:tplc="04100001" w:tentative="1">
+      <w:start w:val="1"/>
+      <w:numFmt w:val="bullet"/>
+      <w:lvlText w:val=""/>
+      <w:lvlJc w:val="left"/>
+      <w:pPr>
+        <w:ind w:left="3228" w:hanging="360"/>
+      </w:pPr>
+      <w:rPr>
+        <w:rFonts w:ascii="Symbol" w:hAnsi="Symbol" w:hint="default"/>
+      </w:rPr>
+    </w:lvl>
+    <w:lvl w:ilvl="4" w:tplc="04100003" w:tentative="1">
+      <w:start w:val="1"/>
+      <w:numFmt w:val="bullet"/>
+      <w:lvlText w:val="o"/>
+      <w:lvlJc w:val="left"/>
+      <w:pPr>
+        <w:ind w:left="3948" w:hanging="360"/>
+      </w:pPr>
+      <w:rPr>
+        <w:rFonts w:ascii="Courier New" w:hAnsi="Courier New" w:cs="Courier New" w:hint="default"/>
+      </w:rPr>
+    </w:lvl>
+    <w:lvl w:ilvl="5" w:tplc="04100005" w:tentative="1">
+      <w:start w:val="1"/>
+      <w:numFmt w:val="bullet"/>
+      <w:lvlText w:val=""/>
+      <w:lvlJc w:val="left"/>
+      <w:pPr>
+        <w:ind w:left="4668" w:hanging="360"/>
+      </w:pPr>
+      <w:rPr>
+        <w:rFonts w:ascii="Wingdings" w:hAnsi="Wingdings" w:hint="default"/>
+      </w:rPr>
+    </w:lvl>
+    <w:lvl w:ilvl="6" w:tplc="04100001" w:tentative="1">
+      <w:start w:val="1"/>
+      <w:numFmt w:val="bullet"/>
+      <w:lvlText w:val=""/>
+      <w:lvlJc w:val="left"/>
+      <w:pPr>
+        <w:ind w:left="5388" w:hanging="360"/>
+      </w:pPr>
+      <w:rPr>
+        <w:rFonts w:ascii="Symbol" w:hAnsi="Symbol" w:hint="default"/>
+      </w:rPr>
+    </w:lvl>
+    <w:lvl w:ilvl="7" w:tplc="04100003" w:tentative="1">
+      <w:start w:val="1"/>
+      <w:numFmt w:val="bullet"/>
+      <w:lvlText w:val="o"/>
+      <w:lvlJc w:val="left"/>
+      <w:pPr>
+        <w:ind w:left="6108" w:hanging="360"/>
+      </w:pPr>
+      <w:rPr>
+        <w:rFonts w:ascii="Courier New" w:hAnsi="Courier New" w:cs="Courier New" w:hint="default"/>
+      </w:rPr>
+    </w:lvl>
+    <w:lvl w:ilvl="8" w:tplc="04100005" w:tentative="1">
+      <w:start w:val="1"/>
+      <w:numFmt w:val="bullet"/>
+      <w:lvlText w:val=""/>
+      <w:lvlJc w:val="left"/>
+      <w:pPr>
+        <w:ind w:left="6828" w:hanging="360"/>
+      </w:pPr>
+      <w:rPr>
+        <w:rFonts w:ascii="Wingdings" w:hAnsi="Wingdings" w:hint="default"/>
+      </w:rPr>
+    </w:lvl>
+  </w:abstractNum>
+  <w:abstractNum w:abstractNumId="3" w15:restartNumberingAfterBreak="0">
+    <w:nsid w:val="3E4C3381"/>
+    <w:multiLevelType w:val="hybridMultilevel"/>
+    <w:tmpl w:val="35AC7482"/>
+    <w:lvl w:ilvl="0" w:tplc="8C44A9E4">
+      <w:start w:val="1"/>
+      <w:numFmt w:val="decimal"/>
+      <w:lvlText w:val="%1-"/>
+      <w:lvlJc w:val="left"/>
+      <w:pPr>
+        <w:ind w:left="720" w:hanging="360"/>
+      </w:pPr>
+      <w:rPr>
+        <w:rFonts w:hint="default"/>
+      </w:rPr>
+    </w:lvl>
+    <w:lvl w:ilvl="1" w:tplc="04100019" w:tentative="1">
+      <w:start w:val="1"/>
+      <w:numFmt w:val="lowerLetter"/>
+      <w:lvlText w:val="%2."/>
+      <w:lvlJc w:val="left"/>
+      <w:pPr>
+        <w:ind w:left="1440" w:hanging="360"/>
+      </w:pPr>
+    </w:lvl>
+    <w:lvl w:ilvl="2" w:tplc="0410001B" w:tentative="1">
+      <w:start w:val="1"/>
+      <w:numFmt w:val="lowerRoman"/>
+      <w:lvlText w:val="%3."/>
+      <w:lvlJc w:val="right"/>
+      <w:pPr>
+        <w:ind w:left="2160" w:hanging="180"/>
+      </w:pPr>
+    </w:lvl>
+    <w:lvl w:ilvl="3" w:tplc="0410000F" w:tentative="1">
+      <w:start w:val="1"/>
+      <w:numFmt w:val="decimal"/>
+      <w:lvlText w:val="%4."/>
+      <w:lvlJc w:val="left"/>
+      <w:pPr>
+        <w:ind w:left="2880" w:hanging="360"/>
+      </w:pPr>
+    </w:lvl>
+    <w:lvl w:ilvl="4" w:tplc="04100019" w:tentative="1">
+      <w:start w:val="1"/>
+      <w:numFmt w:val="lowerLetter"/>
+      <w:lvlText w:val="%5."/>
+      <w:lvlJc w:val="left"/>
+      <w:pPr>
+        <w:ind w:left="3600" w:hanging="360"/>
+      </w:pPr>
+    </w:lvl>
+    <w:lvl w:ilvl="5" w:tplc="0410001B" w:tentative="1">
+      <w:start w:val="1"/>
+      <w:numFmt w:val="lowerRoman"/>
+      <w:lvlText w:val="%6."/>
+      <w:lvlJc w:val="right"/>
+      <w:pPr>
+        <w:ind w:left="4320" w:hanging="180"/>
+      </w:pPr>
+    </w:lvl>
+    <w:lvl w:ilvl="6" w:tplc="0410000F" w:tentative="1">
+      <w:start w:val="1"/>
+      <w:numFmt w:val="decimal"/>
+      <w:lvlText w:val="%7."/>
+      <w:lvlJc w:val="left"/>
+      <w:pPr>
+        <w:ind w:left="5040" w:hanging="360"/>
+      </w:pPr>
+    </w:lvl>
+    <w:lvl w:ilvl="7" w:tplc="04100019" w:tentative="1">
+      <w:start w:val="1"/>
+      <w:numFmt w:val="lowerLetter"/>
+      <w:lvlText w:val="%8."/>
+      <w:lvlJc w:val="left"/>
+      <w:pPr>
+        <w:ind w:left="5760" w:hanging="360"/>
+      </w:pPr>
+    </w:lvl>
+    <w:lvl w:ilvl="8" w:tplc="0410001B" w:tentative="1">
+      <w:start w:val="1"/>
+      <w:numFmt w:val="lowerRoman"/>
+      <w:lvlText w:val="%9."/>
+      <w:lvlJc w:val="right"/>
+      <w:pPr>
+        <w:ind w:left="6480" w:hanging="180"/>
+      </w:pPr>
+    </w:lvl>
+  </w:abstractNum>
+  <w:abstractNum w:abstractNumId="4" w15:restartNumberingAfterBreak="0">
+    <w:nsid w:val="778D3672"/>
+    <w:multiLevelType w:val="hybridMultilevel"/>
+    <w:tmpl w:val="DD385BE8"/>
+    <w:lvl w:ilvl="0" w:tplc="0410000F">
+      <w:start w:val="1"/>
+      <w:numFmt w:val="decimal"/>
+      <w:lvlText w:val="%1."/>
+      <w:lvlJc w:val="left"/>
+      <w:pPr>
+        <w:ind w:left="720" w:hanging="360"/>
+      </w:pPr>
+      <w:rPr>
+        <w:rFonts w:hint="default"/>
+      </w:rPr>
+    </w:lvl>
+    <w:lvl w:ilvl="1" w:tplc="04100019" w:tentative="1">
+      <w:start w:val="1"/>
+      <w:numFmt w:val="lowerLetter"/>
+      <w:lvlText w:val="%2."/>
+      <w:lvlJc w:val="left"/>
+      <w:pPr>
+        <w:ind w:left="1440" w:hanging="360"/>
+      </w:pPr>
+    </w:lvl>
+    <w:lvl w:ilvl="2" w:tplc="0410001B" w:tentative="1">
+      <w:start w:val="1"/>
+      <w:numFmt w:val="lowerRoman"/>
+      <w:lvlText w:val="%3."/>
+      <w:lvlJc w:val="right"/>
+      <w:pPr>
+        <w:ind w:left="2160" w:hanging="180"/>
+      </w:pPr>
+    </w:lvl>
+    <w:lvl w:ilvl="3" w:tplc="0410000F" w:tentative="1">
+      <w:start w:val="1"/>
+      <w:numFmt w:val="decimal"/>
+      <w:lvlText w:val="%4."/>
+      <w:lvlJc w:val="left"/>
+      <w:pPr>
+        <w:ind w:left="2880" w:hanging="360"/>
+      </w:pPr>
+    </w:lvl>
+    <w:lvl w:ilvl="4" w:tplc="04100019" w:tentative="1">
+      <w:start w:val="1"/>
+      <w:numFmt w:val="lowerLetter"/>
+      <w:lvlText w:val="%5."/>
+      <w:lvlJc w:val="left"/>
+      <w:pPr>
+        <w:ind w:left="3600" w:hanging="360"/>
+      </w:pPr>
+    </w:lvl>
+    <w:lvl w:ilvl="5" w:tplc="0410001B" w:tentative="1">
+      <w:start w:val="1"/>
+      <w:numFmt w:val="lowerRoman"/>
+      <w:lvlText w:val="%6."/>
+      <w:lvlJc w:val="right"/>
+      <w:pPr>
+        <w:ind w:left="4320" w:hanging="180"/>
+      </w:pPr>
+    </w:lvl>
+    <w:lvl w:ilvl="6" w:tplc="0410000F" w:tentative="1">
+      <w:start w:val="1"/>
+      <w:numFmt w:val="decimal"/>
+      <w:lvlText w:val="%7."/>
+      <w:lvlJc w:val="left"/>
+      <w:pPr>
+        <w:ind w:left="5040" w:hanging="360"/>
+      </w:pPr>
+    </w:lvl>
+    <w:lvl w:ilvl="7" w:tplc="04100019" w:tentative="1">
+      <w:start w:val="1"/>
+      <w:numFmt w:val="lowerLetter"/>
+      <w:lvlText w:val="%8."/>
+      <w:lvlJc w:val="left"/>
+      <w:pPr>
+        <w:ind w:left="5760" w:hanging="360"/>
+      </w:pPr>
+    </w:lvl>
+    <w:lvl w:ilvl="8" w:tplc="0410001B" w:tentative="1">
+      <w:start w:val="1"/>
+      <w:numFmt w:val="lowerRoman"/>
+      <w:lvlText w:val="%9."/>
+      <w:lvlJc w:val="right"/>
+      <w:pPr>
+        <w:ind w:left="6480" w:hanging="180"/>
+      </w:pPr>
+    </w:lvl>
+  </w:abstractNum>
+  <w:num w:numId="1" w16cid:durableId="679819934">
+    <w:abstractNumId w:val="4"/>
+  </w:num>
+  <w:num w:numId="2" w16cid:durableId="1103920818">
+    <w:abstractNumId w:val="1"/>
+  </w:num>
+  <w:num w:numId="3" w16cid:durableId="2098747139">
+    <w:abstractNumId w:val="3"/>
+  </w:num>
+  <w:num w:numId="4" w16cid:durableId="2087914593">
+    <w:abstractNumId w:val="2"/>
+  </w:num>
+  <w:num w:numId="5" w16cid:durableId="896205552">
+    <w:abstractNumId w:val="0"/>
+  </w:num>
+</w:numbering>
 </file>
 
 <file path=word/styles.xml><?xml version="1.0" encoding="utf-8"?>
@@ -886,7 +2860,6 @@
   <w:style w:type="character" w:default="1" w:styleId="Carpredefinitoparagrafo">
     <w:name w:val="Default Paragraph Font"/>
     <w:uiPriority w:val="1"/>
-    <w:semiHidden/>
     <w:unhideWhenUsed/>
   </w:style>
   <w:style w:type="table" w:default="1" w:styleId="Tabellanormale">
@@ -1200,6 +3173,25 @@
       <w:spacing w:val="5"/>
     </w:rPr>
   </w:style>
+  <w:style w:type="table" w:styleId="Grigliatabellachiara">
+    <w:name w:val="Grid Table Light"/>
+    <w:basedOn w:val="Tabellanormale"/>
+    <w:uiPriority w:val="40"/>
+    <w:rsid w:val="00303562"/>
+    <w:pPr>
+      <w:spacing w:after="0" w:line="240" w:lineRule="auto"/>
+    </w:pPr>
+    <w:tblPr>
+      <w:tblBorders>
+        <w:top w:val="single" w:sz="4" w:space="0" w:color="BFBFBF" w:themeColor="background1" w:themeShade="BF"/>
+        <w:left w:val="single" w:sz="4" w:space="0" w:color="BFBFBF" w:themeColor="background1" w:themeShade="BF"/>
+        <w:bottom w:val="single" w:sz="4" w:space="0" w:color="BFBFBF" w:themeColor="background1" w:themeShade="BF"/>
+        <w:right w:val="single" w:sz="4" w:space="0" w:color="BFBFBF" w:themeColor="background1" w:themeShade="BF"/>
+        <w:insideH w:val="single" w:sz="4" w:space="0" w:color="BFBFBF" w:themeColor="background1" w:themeShade="BF"/>
+        <w:insideV w:val="single" w:sz="4" w:space="0" w:color="BFBFBF" w:themeColor="background1" w:themeShade="BF"/>
+      </w:tblBorders>
+    </w:tblPr>
+  </w:style>
 </w:styles>
 </file>
 

</xml_diff>

<commit_message>
Update a requisiti e gestione progetto
</commit_message>
<xml_diff>
--- a/documentazione/Gestione del progetto.docx
+++ b/documentazione/Gestione del progetto.docx
@@ -43,85 +43,7 @@
           <w:b/>
           <w:bCs/>
         </w:rPr>
-        <w:t xml:space="preserve">Software Life </w:t>
-      </w:r>
-      <w:proofErr w:type="spellStart"/>
-      <w:r>
-        <w:rPr>
-          <w:b/>
-          <w:bCs/>
-        </w:rPr>
-        <w:t>Cycle</w:t>
-      </w:r>
-      <w:proofErr w:type="spellEnd"/>
-    </w:p>
-    <w:p>
-      <w:r>
-        <w:t xml:space="preserve">DEVE indicare il tipo di processo di sviluppo seguito PUO’ formalizzare con diagramma UML una piccola parte del </w:t>
-      </w:r>
-      <w:proofErr w:type="spellStart"/>
-      <w:r>
-        <w:t>sw</w:t>
-      </w:r>
-      <w:proofErr w:type="spellEnd"/>
-      <w:r>
-        <w:t xml:space="preserve"> </w:t>
-      </w:r>
-      <w:proofErr w:type="spellStart"/>
-      <w:r>
-        <w:t>development</w:t>
-      </w:r>
-      <w:proofErr w:type="spellEnd"/>
-      <w:r>
-        <w:t xml:space="preserve"> (ad esempio una </w:t>
-      </w:r>
-      <w:proofErr w:type="spellStart"/>
-      <w:r>
-        <w:t>change</w:t>
-      </w:r>
-      <w:proofErr w:type="spellEnd"/>
-      <w:r>
-        <w:t xml:space="preserve"> </w:t>
-      </w:r>
-      <w:proofErr w:type="spellStart"/>
-      <w:r>
-        <w:t>request</w:t>
-      </w:r>
-      <w:proofErr w:type="spellEnd"/>
-      <w:r>
-        <w:t xml:space="preserve"> come viene trattata) DOVREBBE anche usare un approccio MDA o parte di esso (con </w:t>
-      </w:r>
-      <w:proofErr w:type="spellStart"/>
-      <w:r>
-        <w:t>Yakindu</w:t>
-      </w:r>
-      <w:proofErr w:type="spellEnd"/>
-      <w:r>
-        <w:t xml:space="preserve"> o </w:t>
-      </w:r>
-      <w:proofErr w:type="spellStart"/>
-      <w:r>
-        <w:t>Papyrus</w:t>
-      </w:r>
-      <w:proofErr w:type="spellEnd"/>
-      <w:r>
-        <w:t xml:space="preserve"> UML come visto in classe) POTREBBE presentare il progetto come SPL </w:t>
-      </w:r>
-    </w:p>
-    <w:p>
-      <w:r>
-        <w:t xml:space="preserve">Documentazione: breve documento in cui indicare il tipo di processo seguito effettivamente. Eventuali differenze rispetto a quanto previsto nel project plan vanno indicate qui. Anche ad esempio come sono stati organizzati il </w:t>
-      </w:r>
-      <w:proofErr w:type="spellStart"/>
-      <w:r>
-        <w:t>timebox</w:t>
-      </w:r>
-      <w:proofErr w:type="spellEnd"/>
-      <w:r>
-        <w:t xml:space="preserve"> o gli sprint (ad esempio con le date) vanno indicati qu</w:t>
-      </w:r>
-      <w:r>
-        <w:t>i</w:t>
+        <w:t>Software Life Cycle</w:t>
       </w:r>
     </w:p>
     <w:p/>
@@ -149,20 +71,36 @@
     </w:p>
     <w:p>
       <w:r>
-        <w:t>Il ciclo di vita del software è stato suddiviso in 6 sprint, precedute da una fase di prototipazione che il team ha definito come sprint 0.</w:t>
-      </w:r>
-    </w:p>
-    <w:p>
-      <w:r>
-        <w:t xml:space="preserve">Ogni sprint era preceduto da uno sprint planning e seguito da una sprint review (ed eventualmente una sprint </w:t>
-      </w:r>
-      <w:proofErr w:type="spellStart"/>
-      <w:r>
-        <w:t>restrospective</w:t>
-      </w:r>
-      <w:proofErr w:type="spellEnd"/>
-      <w:r>
-        <w:t>).</w:t>
+        <w:t>Il ciclo di vita è stato strutturato in sprint, preceduti da una fase preliminare.</w:t>
+      </w:r>
+    </w:p>
+    <w:p>
+      <w:pPr>
+        <w:pStyle w:val="Paragrafoelenco"/>
+        <w:numPr>
+          <w:ilvl w:val="0"/>
+          <w:numId w:val="6"/>
+        </w:numPr>
+      </w:pPr>
+      <w:r>
+        <w:t>Sprint 0: fase di prototipazione per comprendere tecnologie e architettura base</w:t>
+      </w:r>
+    </w:p>
+    <w:p>
+      <w:pPr>
+        <w:pStyle w:val="Paragrafoelenco"/>
+        <w:numPr>
+          <w:ilvl w:val="0"/>
+          <w:numId w:val="6"/>
+        </w:numPr>
+      </w:pPr>
+      <w:r>
+        <w:t>Sprint 1-6: sviluppo delle funzionalità</w:t>
+      </w:r>
+    </w:p>
+    <w:p>
+      <w:r>
+        <w:t>Ogni sprint era preceduto da uno sprint planning e seguito da una sprint review (ed eventualmente una sprint restrospective).</w:t>
       </w:r>
     </w:p>
     <w:p>
@@ -171,8 +109,16 @@
       </w:r>
     </w:p>
     <w:p>
-      <w:r>
-        <w:t>Differenze con il project plan:</w:t>
+      <w:pPr>
+        <w:rPr>
+          <w:u w:val="single"/>
+        </w:rPr>
+      </w:pPr>
+      <w:r>
+        <w:rPr>
+          <w:u w:val="single"/>
+        </w:rPr>
+        <w:t>Differenze con il project plan</w:t>
       </w:r>
     </w:p>
     <w:p>
@@ -187,20 +133,18 @@
     </w:p>
     <w:p>
       <w:r>
-        <w:t xml:space="preserve">La gestione degli sprint è stata la seguente (le stesse informazioni sono ritrovabili all’interno del file </w:t>
-      </w:r>
-      <w:proofErr w:type="spellStart"/>
-      <w:r>
-        <w:t>Meeting_Sprint</w:t>
-      </w:r>
-      <w:proofErr w:type="spellEnd"/>
-      <w:r>
-        <w:t xml:space="preserve">): </w:t>
-      </w:r>
-    </w:p>
-    <w:p>
-      <w:r>
-        <w:t>Sprint 0 (Setup): 15/10 - 02/11 (Analisi, Scelta Tecnologie)</w:t>
+        <w:t xml:space="preserve">La gestione degli sprint è stata la seguente (le stesse informazioni sono ritrovabili all’interno del file Meeting_Sprint): </w:t>
+      </w:r>
+    </w:p>
+    <w:p>
+      <w:r>
+        <w:t>Sprint 0 (Setup</w:t>
+      </w:r>
+      <w:r>
+        <w:t xml:space="preserve"> e prototipazione</w:t>
+      </w:r>
+      <w:r>
+        <w:t>): 15/10 - 02/11 (Analisi, Scelta Tecnologie)</w:t>
       </w:r>
     </w:p>
     <w:p>
@@ -220,15 +164,7 @@
     </w:p>
     <w:p>
       <w:r>
-        <w:t xml:space="preserve">Sprint 4 (QR e garage): 28/11 - 10/12 (QR Code, Auto, </w:t>
-      </w:r>
-      <w:proofErr w:type="spellStart"/>
-      <w:r>
-        <w:t>Refactoring</w:t>
-      </w:r>
-      <w:proofErr w:type="spellEnd"/>
-      <w:r>
-        <w:t>)</w:t>
+        <w:t>Sprint 4 (QR e garage): 28/11 - 10/12 (QR Code, Auto, Refactoring)</w:t>
       </w:r>
     </w:p>
     <w:p>
@@ -241,6 +177,9 @@
         <w:t>Sprint 6 (Finale): Gennaio (Documentazione, Chiusura)</w:t>
       </w:r>
     </w:p>
+    <w:p/>
+    <w:p/>
+    <w:p/>
     <w:p/>
     <w:p/>
     <w:p>
@@ -267,6 +206,7 @@
           <w:iCs/>
           <w:u w:val="single"/>
         </w:rPr>
+        <w:lastRenderedPageBreak/>
         <w:t>Approccio MDA</w:t>
       </w:r>
     </w:p>
@@ -296,6 +236,9 @@
           <w:tab w:val="left" w:pos="1888"/>
         </w:tabs>
       </w:pPr>
+      <w:r>
+        <w:t>Qui un esempio di diagramma degli stati della prenotazione, implementato poi all’interno del codice.</w:t>
+      </w:r>
     </w:p>
     <w:p>
       <w:pPr>
@@ -303,43 +246,130 @@
           <w:tab w:val="left" w:pos="1888"/>
         </w:tabs>
       </w:pPr>
-    </w:p>
-    <w:p>
-      <w:pPr>
+      <w:r>
+        <w:rPr>
+          <w:noProof/>
+        </w:rPr>
+        <w:drawing>
+          <wp:anchor distT="0" distB="0" distL="114300" distR="114300" simplePos="0" relativeHeight="251658240" behindDoc="0" locked="0" layoutInCell="1" allowOverlap="1" wp14:anchorId="4C9F5D4A">
+            <wp:simplePos x="0" y="0"/>
+            <wp:positionH relativeFrom="column">
+              <wp:posOffset>1771575</wp:posOffset>
+            </wp:positionH>
+            <wp:positionV relativeFrom="paragraph">
+              <wp:posOffset>67646</wp:posOffset>
+            </wp:positionV>
+            <wp:extent cx="3580130" cy="1376045"/>
+            <wp:effectExtent l="0" t="0" r="1270" b="0"/>
+            <wp:wrapNone/>
+            <wp:docPr id="813170330" name="Immagine 1"/>
+            <wp:cNvGraphicFramePr>
+              <a:graphicFrameLocks xmlns:a="http://schemas.openxmlformats.org/drawingml/2006/main" noChangeAspect="1"/>
+            </wp:cNvGraphicFramePr>
+            <a:graphic xmlns:a="http://schemas.openxmlformats.org/drawingml/2006/main">
+              <a:graphicData uri="http://schemas.openxmlformats.org/drawingml/2006/picture">
+                <pic:pic xmlns:pic="http://schemas.openxmlformats.org/drawingml/2006/picture">
+                  <pic:nvPicPr>
+                    <pic:cNvPr id="0" name="Picture 2"/>
+                    <pic:cNvPicPr>
+                      <a:picLocks noChangeAspect="1" noChangeArrowheads="1"/>
+                    </pic:cNvPicPr>
+                  </pic:nvPicPr>
+                  <pic:blipFill rotWithShape="1">
+                    <a:blip r:embed="rId5" cstate="print">
+                      <a:extLst>
+                        <a:ext uri="{28A0092B-C50C-407E-A947-70E740481C1C}">
+                          <a14:useLocalDpi xmlns:a14="http://schemas.microsoft.com/office/drawing/2010/main" val="0"/>
+                        </a:ext>
+                      </a:extLst>
+                    </a:blip>
+                    <a:srcRect t="29584"/>
+                    <a:stretch>
+                      <a:fillRect/>
+                    </a:stretch>
+                  </pic:blipFill>
+                  <pic:spPr bwMode="auto">
+                    <a:xfrm>
+                      <a:off x="0" y="0"/>
+                      <a:ext cx="3580130" cy="1376045"/>
+                    </a:xfrm>
+                    <a:prstGeom prst="rect">
+                      <a:avLst/>
+                    </a:prstGeom>
+                    <a:noFill/>
+                    <a:ln>
+                      <a:noFill/>
+                    </a:ln>
+                    <a:extLst>
+                      <a:ext uri="{53640926-AAD7-44D8-BBD7-CCE9431645EC}">
+                        <a14:shadowObscured xmlns:a14="http://schemas.microsoft.com/office/drawing/2010/main"/>
+                      </a:ext>
+                    </a:extLst>
+                  </pic:spPr>
+                </pic:pic>
+              </a:graphicData>
+            </a:graphic>
+            <wp14:sizeRelV relativeFrom="margin">
+              <wp14:pctHeight>0</wp14:pctHeight>
+            </wp14:sizeRelV>
+          </wp:anchor>
+        </w:drawing>
+      </w:r>
+      <w:r>
+        <w:t>Stati possibili:</w:t>
+      </w:r>
+    </w:p>
+    <w:p>
+      <w:pPr>
+        <w:pStyle w:val="Paragrafoelenco"/>
+        <w:numPr>
+          <w:ilvl w:val="0"/>
+          <w:numId w:val="7"/>
+        </w:numPr>
         <w:tabs>
           <w:tab w:val="left" w:pos="1888"/>
         </w:tabs>
       </w:pPr>
       <w:r>
-        <w:t>----DIAGRAMMA DI GESTIONE MDA PUO ESSERE MESSO QUI</w:t>
-      </w:r>
-      <w:r>
-        <w:t xml:space="preserve"> TIPO DIAGRAMMA ATTIVITA / STATI</w:t>
-      </w:r>
-      <w:r>
-        <w:t>-----</w:t>
-      </w:r>
-    </w:p>
-    <w:p>
-      <w:pPr>
+        <w:t>Futura</w:t>
+      </w:r>
+    </w:p>
+    <w:p>
+      <w:pPr>
+        <w:pStyle w:val="Paragrafoelenco"/>
+        <w:numPr>
+          <w:ilvl w:val="0"/>
+          <w:numId w:val="7"/>
+        </w:numPr>
         <w:tabs>
           <w:tab w:val="left" w:pos="1888"/>
         </w:tabs>
       </w:pPr>
-    </w:p>
-    <w:p>
-      <w:pPr>
-        <w:pStyle w:val="Paragrafoelenco"/>
+      <w:r>
+        <w:t>Attiva</w:t>
+      </w:r>
+    </w:p>
+    <w:p>
+      <w:pPr>
+        <w:pStyle w:val="Paragrafoelenco"/>
+        <w:numPr>
+          <w:ilvl w:val="0"/>
+          <w:numId w:val="7"/>
+        </w:numPr>
         <w:tabs>
           <w:tab w:val="left" w:pos="1888"/>
         </w:tabs>
       </w:pPr>
+      <w:r>
+        <w:t>Passata</w:t>
+      </w:r>
     </w:p>
     <w:p>
       <w:pPr>
         <w:tabs>
           <w:tab w:val="left" w:pos="1888"/>
         </w:tabs>
+        <w:jc w:val="center"/>
       </w:pPr>
     </w:p>
     <w:p>
@@ -347,158 +377,6 @@
         <w:tabs>
           <w:tab w:val="left" w:pos="1888"/>
         </w:tabs>
-      </w:pPr>
-    </w:p>
-    <w:p>
-      <w:pPr>
-        <w:rPr>
-          <w:b/>
-          <w:bCs/>
-        </w:rPr>
-      </w:pPr>
-    </w:p>
-    <w:p>
-      <w:pPr>
-        <w:rPr>
-          <w:b/>
-          <w:bCs/>
-        </w:rPr>
-      </w:pPr>
-    </w:p>
-    <w:p>
-      <w:pPr>
-        <w:rPr>
-          <w:b/>
-          <w:bCs/>
-        </w:rPr>
-      </w:pPr>
-    </w:p>
-    <w:p>
-      <w:pPr>
-        <w:rPr>
-          <w:b/>
-          <w:bCs/>
-        </w:rPr>
-      </w:pPr>
-    </w:p>
-    <w:p>
-      <w:pPr>
-        <w:rPr>
-          <w:b/>
-          <w:bCs/>
-        </w:rPr>
-      </w:pPr>
-    </w:p>
-    <w:p>
-      <w:pPr>
-        <w:rPr>
-          <w:b/>
-          <w:bCs/>
-        </w:rPr>
-      </w:pPr>
-    </w:p>
-    <w:p>
-      <w:pPr>
-        <w:rPr>
-          <w:b/>
-          <w:bCs/>
-        </w:rPr>
-      </w:pPr>
-    </w:p>
-    <w:p>
-      <w:pPr>
-        <w:rPr>
-          <w:b/>
-          <w:bCs/>
-        </w:rPr>
-      </w:pPr>
-    </w:p>
-    <w:p>
-      <w:pPr>
-        <w:rPr>
-          <w:b/>
-          <w:bCs/>
-        </w:rPr>
-      </w:pPr>
-    </w:p>
-    <w:p>
-      <w:pPr>
-        <w:rPr>
-          <w:b/>
-          <w:bCs/>
-        </w:rPr>
-      </w:pPr>
-    </w:p>
-    <w:p>
-      <w:pPr>
-        <w:rPr>
-          <w:b/>
-          <w:bCs/>
-        </w:rPr>
-      </w:pPr>
-    </w:p>
-    <w:p>
-      <w:pPr>
-        <w:rPr>
-          <w:b/>
-          <w:bCs/>
-        </w:rPr>
-      </w:pPr>
-    </w:p>
-    <w:p>
-      <w:pPr>
-        <w:rPr>
-          <w:b/>
-          <w:bCs/>
-        </w:rPr>
-      </w:pPr>
-    </w:p>
-    <w:p>
-      <w:pPr>
-        <w:rPr>
-          <w:b/>
-          <w:bCs/>
-        </w:rPr>
-      </w:pPr>
-    </w:p>
-    <w:p>
-      <w:pPr>
-        <w:rPr>
-          <w:b/>
-          <w:bCs/>
-        </w:rPr>
-      </w:pPr>
-    </w:p>
-    <w:p>
-      <w:pPr>
-        <w:rPr>
-          <w:b/>
-          <w:bCs/>
-        </w:rPr>
-      </w:pPr>
-    </w:p>
-    <w:p>
-      <w:pPr>
-        <w:rPr>
-          <w:b/>
-          <w:bCs/>
-        </w:rPr>
-      </w:pPr>
-    </w:p>
-    <w:p>
-      <w:pPr>
-        <w:rPr>
-          <w:b/>
-          <w:bCs/>
-        </w:rPr>
-      </w:pPr>
-    </w:p>
-    <w:p>
-      <w:pPr>
-        <w:rPr>
-          <w:b/>
-          <w:bCs/>
-        </w:rPr>
       </w:pPr>
     </w:p>
     <w:p>
@@ -511,154 +389,27 @@
     </w:p>
     <w:p>
       <w:pPr>
+        <w:tabs>
+          <w:tab w:val="left" w:pos="1888"/>
+        </w:tabs>
+        <w:spacing w:after="0" w:line="276" w:lineRule="auto"/>
+      </w:pPr>
+    </w:p>
+    <w:p>
+      <w:pPr>
         <w:rPr>
           <w:b/>
           <w:bCs/>
         </w:rPr>
       </w:pPr>
-      <w:proofErr w:type="spellStart"/>
       <w:r>
         <w:rPr>
           <w:b/>
           <w:bCs/>
         </w:rPr>
-        <w:t>Configuration</w:t>
-      </w:r>
-      <w:proofErr w:type="spellEnd"/>
-      <w:r>
-        <w:rPr>
-          <w:b/>
-          <w:bCs/>
-        </w:rPr>
-        <w:t xml:space="preserve"> Management</w:t>
-      </w:r>
-    </w:p>
-    <w:p>
-      <w:r>
-        <w:t xml:space="preserve">DEVE usare un sistema per il </w:t>
-      </w:r>
-      <w:proofErr w:type="spellStart"/>
-      <w:r>
-        <w:t>configuration</w:t>
-      </w:r>
-      <w:proofErr w:type="spellEnd"/>
-      <w:r>
-        <w:t xml:space="preserve"> management (consigliato </w:t>
-      </w:r>
-      <w:proofErr w:type="spellStart"/>
-      <w:r>
-        <w:t>github</w:t>
-      </w:r>
-      <w:proofErr w:type="spellEnd"/>
-      <w:r>
-        <w:t>) con i relativi comandi (</w:t>
-      </w:r>
-      <w:proofErr w:type="spellStart"/>
-      <w:r>
-        <w:t>git</w:t>
-      </w:r>
-      <w:proofErr w:type="spellEnd"/>
-      <w:r>
-        <w:t xml:space="preserve"> </w:t>
-      </w:r>
-      <w:proofErr w:type="spellStart"/>
-      <w:r>
-        <w:t>add</w:t>
-      </w:r>
-      <w:proofErr w:type="spellEnd"/>
-      <w:r>
-        <w:t xml:space="preserve">, </w:t>
-      </w:r>
-      <w:proofErr w:type="spellStart"/>
-      <w:r>
-        <w:t>commit</w:t>
-      </w:r>
-      <w:proofErr w:type="spellEnd"/>
-      <w:r>
-        <w:t xml:space="preserve">, </w:t>
-      </w:r>
-      <w:proofErr w:type="spellStart"/>
-      <w:r>
-        <w:t>push</w:t>
-      </w:r>
-      <w:proofErr w:type="spellEnd"/>
-      <w:r>
-        <w:t xml:space="preserve"> etc.) DEVE dimostrare di aver usato </w:t>
-      </w:r>
-      <w:proofErr w:type="spellStart"/>
-      <w:r>
-        <w:t>issuses</w:t>
-      </w:r>
-      <w:proofErr w:type="spellEnd"/>
-      <w:r>
-        <w:t xml:space="preserve">, </w:t>
-      </w:r>
-      <w:proofErr w:type="spellStart"/>
-      <w:r>
-        <w:t>branches</w:t>
-      </w:r>
-      <w:proofErr w:type="spellEnd"/>
-      <w:r>
-        <w:t xml:space="preserve">, pull </w:t>
-      </w:r>
-      <w:proofErr w:type="spellStart"/>
-      <w:r>
-        <w:t>requests</w:t>
-      </w:r>
-      <w:proofErr w:type="spellEnd"/>
-      <w:r>
-        <w:t xml:space="preserve">, e code reviews PUO’ usare la project board (tipo </w:t>
-      </w:r>
-      <w:proofErr w:type="spellStart"/>
-      <w:r>
-        <w:t>kanban</w:t>
-      </w:r>
-      <w:proofErr w:type="spellEnd"/>
-      <w:r>
-        <w:t xml:space="preserve"> o varianti simili) Documentazione: aggiungere al documento eventuali strumenti usati. Gli </w:t>
-      </w:r>
-      <w:proofErr w:type="spellStart"/>
-      <w:r>
-        <w:t>issue</w:t>
-      </w:r>
-      <w:proofErr w:type="spellEnd"/>
-      <w:r>
-        <w:t xml:space="preserve"> e l’uso di </w:t>
-      </w:r>
-      <w:proofErr w:type="spellStart"/>
-      <w:r>
-        <w:t>github</w:t>
-      </w:r>
-      <w:proofErr w:type="spellEnd"/>
-      <w:r>
-        <w:t xml:space="preserve"> è da vedere sul sito </w:t>
-      </w:r>
-      <w:proofErr w:type="spellStart"/>
-      <w:r>
-        <w:t>github</w:t>
-      </w:r>
-      <w:proofErr w:type="spellEnd"/>
-      <w:r>
-        <w:t xml:space="preserve"> (non è necessario documentarlo ma si possono portare alcune statistiche come numero di </w:t>
-      </w:r>
-      <w:proofErr w:type="spellStart"/>
-      <w:r>
-        <w:t>commit</w:t>
-      </w:r>
-      <w:proofErr w:type="spellEnd"/>
-      <w:r>
-        <w:t xml:space="preserve">, di </w:t>
-      </w:r>
-      <w:proofErr w:type="spellStart"/>
-      <w:r>
-        <w:t>issues</w:t>
-      </w:r>
-      <w:proofErr w:type="spellEnd"/>
-      <w:r>
-        <w:t xml:space="preserve"> e cose del genere).</w:t>
-      </w:r>
-    </w:p>
-    <w:p/>
+        <w:t>Configuration Management</w:t>
+      </w:r>
+    </w:p>
     <w:p>
       <w:pPr>
         <w:rPr>
@@ -678,15 +429,7 @@
     </w:p>
     <w:p>
       <w:r>
-        <w:t xml:space="preserve">Il team ha utilizzato </w:t>
-      </w:r>
-      <w:proofErr w:type="spellStart"/>
-      <w:r>
-        <w:t>github</w:t>
-      </w:r>
-      <w:proofErr w:type="spellEnd"/>
-      <w:r>
-        <w:t xml:space="preserve"> come gestore della configurazione.</w:t>
+        <w:t>Il team ha utilizzato github come gestore della configurazione.</w:t>
       </w:r>
     </w:p>
     <w:p>
@@ -696,39 +439,7 @@
     </w:p>
     <w:p>
       <w:r>
-        <w:t xml:space="preserve">Branch: sono stati creati ed utilizzati n </w:t>
-      </w:r>
-      <w:proofErr w:type="spellStart"/>
-      <w:r>
-        <w:t>branch</w:t>
-      </w:r>
-      <w:proofErr w:type="spellEnd"/>
-      <w:r>
-        <w:t xml:space="preserve">, per gestire modifiche complesse o per prove su cambiamenti interni al sistema. Tutti i </w:t>
-      </w:r>
-      <w:proofErr w:type="spellStart"/>
-      <w:r>
-        <w:t>commit</w:t>
-      </w:r>
-      <w:proofErr w:type="spellEnd"/>
-      <w:r>
-        <w:t xml:space="preserve"> poi sono stati inseriti nel </w:t>
-      </w:r>
-      <w:proofErr w:type="spellStart"/>
-      <w:r>
-        <w:t>main</w:t>
-      </w:r>
-      <w:proofErr w:type="spellEnd"/>
-      <w:r>
-        <w:t xml:space="preserve"> </w:t>
-      </w:r>
-      <w:proofErr w:type="spellStart"/>
-      <w:r>
-        <w:t>branch</w:t>
-      </w:r>
-      <w:proofErr w:type="spellEnd"/>
-      <w:r>
-        <w:t>, che contiene la versione stabile, corretta e finale del progetto.</w:t>
+        <w:t>Branch: sono stati creati ed utilizzati n branch, per gestire modifiche complesse o per prove su cambiamenti interni al sistema. Tutti i commit poi sono stati inseriti nel main branch, che contiene la versione stabile, corretta e finale del progetto.</w:t>
       </w:r>
     </w:p>
     <w:p>
@@ -754,36 +465,16 @@
           <w:iCs/>
           <w:u w:val="single"/>
         </w:rPr>
-        <w:t xml:space="preserve">Comandi </w:t>
-      </w:r>
-      <w:proofErr w:type="spellStart"/>
-      <w:r>
-        <w:rPr>
-          <w:i/>
-          <w:iCs/>
-          <w:u w:val="single"/>
-        </w:rPr>
-        <w:t>git</w:t>
-      </w:r>
-      <w:proofErr w:type="spellEnd"/>
-      <w:r>
-        <w:rPr>
-          <w:i/>
-          <w:iCs/>
-          <w:u w:val="single"/>
-        </w:rPr>
-        <w:t xml:space="preserve"> utilizzati</w:t>
+        <w:t>Comandi git utilizzati</w:t>
       </w:r>
     </w:p>
     <w:p>
       <w:r>
         <w:t xml:space="preserve">Le operazioni venivano gestite tramite </w:t>
       </w:r>
-      <w:proofErr w:type="spellStart"/>
-      <w:r>
-        <w:t>github</w:t>
-      </w:r>
-      <w:proofErr w:type="spellEnd"/>
+      <w:r>
+        <w:t>GitHub</w:t>
+      </w:r>
       <w:r>
         <w:t xml:space="preserve"> desktop, questo ci permetteva di utilizzare i comandi principali senza doverli esplicitare direttamente.</w:t>
       </w:r>
@@ -797,11 +488,9 @@
       <w:r>
         <w:t xml:space="preserve">-Apertura </w:t>
       </w:r>
-      <w:proofErr w:type="spellStart"/>
-      <w:r>
-        <w:t>github</w:t>
-      </w:r>
-      <w:proofErr w:type="spellEnd"/>
+      <w:r>
+        <w:t>GitHub</w:t>
+      </w:r>
       <w:r>
         <w:t xml:space="preserve"> desktop</w:t>
       </w:r>
@@ -817,23 +506,7 @@
         <w:t>progetto</w:t>
       </w:r>
       <w:r>
-        <w:t xml:space="preserve"> (</w:t>
-      </w:r>
-      <w:proofErr w:type="spellStart"/>
-      <w:r>
-        <w:t>git</w:t>
-      </w:r>
-      <w:proofErr w:type="spellEnd"/>
-      <w:r>
-        <w:t xml:space="preserve"> fetch, </w:t>
-      </w:r>
-      <w:proofErr w:type="spellStart"/>
-      <w:r>
-        <w:t>git</w:t>
-      </w:r>
-      <w:proofErr w:type="spellEnd"/>
-      <w:r>
-        <w:t xml:space="preserve"> pull)</w:t>
+        <w:t xml:space="preserve"> (git fetch, git pull)</w:t>
       </w:r>
     </w:p>
     <w:p>
@@ -846,166 +519,23 @@
         <w:t>-</w:t>
       </w:r>
       <w:r>
-        <w:t xml:space="preserve">Creazione e invio </w:t>
-      </w:r>
-      <w:proofErr w:type="spellStart"/>
-      <w:r>
-        <w:t>commit</w:t>
-      </w:r>
-      <w:proofErr w:type="spellEnd"/>
-      <w:r>
-        <w:t xml:space="preserve"> con titolo e descrizione</w:t>
-      </w:r>
-      <w:r>
-        <w:t xml:space="preserve"> (</w:t>
-      </w:r>
-      <w:proofErr w:type="spellStart"/>
-      <w:r>
-        <w:t>git</w:t>
-      </w:r>
-      <w:proofErr w:type="spellEnd"/>
-      <w:r>
-        <w:t xml:space="preserve"> </w:t>
-      </w:r>
-      <w:proofErr w:type="spellStart"/>
-      <w:r>
-        <w:t>add</w:t>
-      </w:r>
-      <w:proofErr w:type="spellEnd"/>
-      <w:r>
-        <w:t xml:space="preserve">, </w:t>
-      </w:r>
-      <w:proofErr w:type="spellStart"/>
-      <w:r>
-        <w:t>git</w:t>
-      </w:r>
-      <w:proofErr w:type="spellEnd"/>
-      <w:r>
-        <w:t xml:space="preserve"> </w:t>
-      </w:r>
-      <w:proofErr w:type="spellStart"/>
-      <w:r>
-        <w:t>commit</w:t>
-      </w:r>
-      <w:proofErr w:type="spellEnd"/>
-      <w:r>
-        <w:t xml:space="preserve"> -, “…”)</w:t>
-      </w:r>
-    </w:p>
-    <w:p>
-      <w:r>
-        <w:t xml:space="preserve">-Push del </w:t>
-      </w:r>
-      <w:proofErr w:type="spellStart"/>
-      <w:r>
-        <w:t>commit</w:t>
-      </w:r>
-      <w:proofErr w:type="spellEnd"/>
-      <w:r>
-        <w:t xml:space="preserve"> sulla repo</w:t>
-      </w:r>
-      <w:r>
-        <w:t xml:space="preserve"> (</w:t>
-      </w:r>
-      <w:proofErr w:type="spellStart"/>
-      <w:r>
-        <w:t>git</w:t>
-      </w:r>
-      <w:proofErr w:type="spellEnd"/>
-      <w:r>
-        <w:t xml:space="preserve"> </w:t>
-      </w:r>
-      <w:proofErr w:type="spellStart"/>
-      <w:r>
-        <w:t>push</w:t>
-      </w:r>
-      <w:proofErr w:type="spellEnd"/>
-      <w:r>
-        <w:t>)</w:t>
+        <w:t>Creazione e invio commit con titolo e descrizione</w:t>
+      </w:r>
+      <w:r>
+        <w:t xml:space="preserve"> (git add, git commit -, “…”)</w:t>
+      </w:r>
+    </w:p>
+    <w:p>
+      <w:r>
+        <w:t>-Push del commit sulla repo</w:t>
+      </w:r>
+      <w:r>
+        <w:t xml:space="preserve"> (git push)</w:t>
       </w:r>
     </w:p>
     <w:p/>
-    <w:p>
-      <w:pPr>
-        <w:rPr>
-          <w:i/>
-          <w:iCs/>
-          <w:u w:val="single"/>
-        </w:rPr>
-      </w:pPr>
-    </w:p>
-    <w:p>
-      <w:pPr>
-        <w:rPr>
-          <w:i/>
-          <w:iCs/>
-          <w:u w:val="single"/>
-        </w:rPr>
-      </w:pPr>
-    </w:p>
-    <w:p>
-      <w:pPr>
-        <w:rPr>
-          <w:i/>
-          <w:iCs/>
-          <w:u w:val="single"/>
-        </w:rPr>
-      </w:pPr>
-    </w:p>
-    <w:p>
-      <w:pPr>
-        <w:rPr>
-          <w:i/>
-          <w:iCs/>
-          <w:u w:val="single"/>
-        </w:rPr>
-      </w:pPr>
-    </w:p>
-    <w:p>
-      <w:pPr>
-        <w:rPr>
-          <w:i/>
-          <w:iCs/>
-          <w:u w:val="single"/>
-        </w:rPr>
-      </w:pPr>
-    </w:p>
-    <w:p>
-      <w:pPr>
-        <w:rPr>
-          <w:i/>
-          <w:iCs/>
-          <w:u w:val="single"/>
-        </w:rPr>
-      </w:pPr>
-    </w:p>
-    <w:p>
-      <w:pPr>
-        <w:rPr>
-          <w:i/>
-          <w:iCs/>
-          <w:u w:val="single"/>
-        </w:rPr>
-      </w:pPr>
-    </w:p>
-    <w:p>
-      <w:pPr>
-        <w:rPr>
-          <w:i/>
-          <w:iCs/>
-          <w:u w:val="single"/>
-        </w:rPr>
-      </w:pPr>
-    </w:p>
-    <w:p>
-      <w:pPr>
-        <w:rPr>
-          <w:i/>
-          <w:iCs/>
-          <w:u w:val="single"/>
-        </w:rPr>
-      </w:pPr>
-    </w:p>
+    <w:p/>
+    <w:p/>
     <w:p>
       <w:pPr>
         <w:rPr>
@@ -1078,7 +608,7 @@
                     <pic:cNvPicPr/>
                   </pic:nvPicPr>
                   <pic:blipFill>
-                    <a:blip r:embed="rId5"/>
+                    <a:blip r:embed="rId6"/>
                     <a:stretch>
                       <a:fillRect/>
                     </a:stretch>
@@ -1113,15 +643,7 @@
         </w:numPr>
       </w:pPr>
       <w:r>
-        <w:t xml:space="preserve">Project Board: il team ha utilizzato la </w:t>
-      </w:r>
-      <w:proofErr w:type="spellStart"/>
-      <w:r>
-        <w:t>kanban</w:t>
-      </w:r>
-      <w:proofErr w:type="spellEnd"/>
-      <w:r>
-        <w:t xml:space="preserve"> board automatica di GitHub, messa con visibilità privata.</w:t>
+        <w:t>Project Board: il team ha utilizzato la kanban board automatica di GitHub, messa con visibilità privata.</w:t>
       </w:r>
     </w:p>
     <w:p>
@@ -1171,7 +693,7 @@
                     </pic:cNvPicPr>
                   </pic:nvPicPr>
                   <pic:blipFill>
-                    <a:blip r:embed="rId6">
+                    <a:blip r:embed="rId7">
                       <a:extLst>
                         <a:ext uri="{28A0092B-C50C-407E-A947-70E740481C1C}">
                           <a14:useLocalDpi xmlns:a14="http://schemas.microsoft.com/office/drawing/2010/main" val="0"/>
@@ -1229,36 +751,8 @@
           <w:u w:val="single"/>
         </w:rPr>
         <w:lastRenderedPageBreak/>
-        <w:t xml:space="preserve">Gestione delle </w:t>
-      </w:r>
-      <w:proofErr w:type="spellStart"/>
-      <w:r>
-        <w:rPr>
-          <w:i/>
-          <w:iCs/>
-          <w:u w:val="single"/>
-        </w:rPr>
-        <w:t>change</w:t>
-      </w:r>
-      <w:proofErr w:type="spellEnd"/>
-      <w:r>
-        <w:rPr>
-          <w:i/>
-          <w:iCs/>
-          <w:u w:val="single"/>
-        </w:rPr>
-        <w:t xml:space="preserve"> </w:t>
-      </w:r>
-      <w:proofErr w:type="spellStart"/>
-      <w:r>
-        <w:rPr>
-          <w:i/>
-          <w:iCs/>
-          <w:u w:val="single"/>
-        </w:rPr>
-        <w:t>request</w:t>
-      </w:r>
-      <w:proofErr w:type="spellEnd"/>
+        <w:t>Gestione delle change request</w:t>
+      </w:r>
     </w:p>
     <w:p>
       <w:pPr>
@@ -1281,31 +775,7 @@
         <w:spacing w:line="276" w:lineRule="auto"/>
       </w:pPr>
       <w:r>
-        <w:t xml:space="preserve">Modifiche minori: In caso di modifiche minori, </w:t>
-      </w:r>
-      <w:proofErr w:type="spellStart"/>
-      <w:r>
-        <w:t>refactoring</w:t>
-      </w:r>
-      <w:proofErr w:type="spellEnd"/>
-      <w:r>
-        <w:t xml:space="preserve"> o aggiornamenti a diagrammi o documentazione ciascun membro del gruppo di occupava di modificare il codice e verificare il suo corretto funzionamento. Il </w:t>
-      </w:r>
-      <w:proofErr w:type="spellStart"/>
-      <w:r>
-        <w:t>commit</w:t>
-      </w:r>
-      <w:proofErr w:type="spellEnd"/>
-      <w:r>
-        <w:t xml:space="preserve"> veniva poi effettuato direttamente sul ramo </w:t>
-      </w:r>
-      <w:proofErr w:type="spellStart"/>
-      <w:r>
-        <w:t>main</w:t>
-      </w:r>
-      <w:proofErr w:type="spellEnd"/>
-      <w:r>
-        <w:t>.</w:t>
+        <w:t>Modifiche minori: In caso di modifiche minori, refactoring o aggiornamenti a diagrammi o documentazione ciascun membro del gruppo di occupava di modificare il codice e verificare il suo corretto funzionamento. Il commit veniva poi effettuato direttamente sul ramo main.</w:t>
       </w:r>
     </w:p>
     <w:p>
@@ -1330,15 +800,7 @@
         <w:spacing w:after="0" w:line="276" w:lineRule="auto"/>
       </w:pPr>
       <w:r>
-        <w:t xml:space="preserve">In caso di modifiche più importanti o nuove funzionalità tracciate attraverso </w:t>
-      </w:r>
-      <w:proofErr w:type="spellStart"/>
-      <w:r>
-        <w:t>issue</w:t>
-      </w:r>
-      <w:proofErr w:type="spellEnd"/>
-      <w:r>
-        <w:t xml:space="preserve"> il flusso seguito era il seguente:</w:t>
+        <w:t>In caso di modifiche più importanti o nuove funzionalità tracciate attraverso issue il flusso seguito era il seguente:</w:t>
       </w:r>
     </w:p>
     <w:p>
@@ -1350,15 +812,7 @@
         <w:spacing w:after="0" w:line="276" w:lineRule="auto"/>
       </w:pPr>
       <w:r>
-        <w:t xml:space="preserve">-Apertura </w:t>
-      </w:r>
-      <w:proofErr w:type="spellStart"/>
-      <w:r>
-        <w:t>issue</w:t>
-      </w:r>
-      <w:proofErr w:type="spellEnd"/>
-      <w:r>
-        <w:t xml:space="preserve"> da parte del membro del gruppo (in particolare dal product owner)</w:t>
+        <w:t>-Apertura issue da parte del membro del gruppo (in particolare dal product owner)</w:t>
       </w:r>
     </w:p>
     <w:p>
@@ -1370,15 +824,7 @@
         <w:spacing w:after="0" w:line="276" w:lineRule="auto"/>
       </w:pPr>
       <w:r>
-        <w:t xml:space="preserve">-Assegnazione </w:t>
-      </w:r>
-      <w:proofErr w:type="spellStart"/>
-      <w:r>
-        <w:t>issue</w:t>
-      </w:r>
-      <w:proofErr w:type="spellEnd"/>
-      <w:r>
-        <w:t xml:space="preserve"> o presa in carica da parte del membro del team</w:t>
+        <w:t>-Assegnazione issue o presa in carica da parte del membro del team</w:t>
       </w:r>
     </w:p>
     <w:p>
@@ -1390,15 +836,7 @@
         <w:spacing w:after="0" w:line="276" w:lineRule="auto"/>
       </w:pPr>
       <w:r>
-        <w:t xml:space="preserve">-Apertura </w:t>
-      </w:r>
-      <w:proofErr w:type="spellStart"/>
-      <w:r>
-        <w:t>branch</w:t>
-      </w:r>
-      <w:proofErr w:type="spellEnd"/>
-      <w:r>
-        <w:t xml:space="preserve"> dedicato (non sempre è stato necessario)</w:t>
+        <w:t>-Apertura branch dedicato (non sempre è stato necessario)</w:t>
       </w:r>
     </w:p>
     <w:p>
@@ -1422,15 +860,7 @@
         <w:spacing w:after="0" w:line="276" w:lineRule="auto"/>
       </w:pPr>
       <w:r>
-        <w:t xml:space="preserve">-Pull </w:t>
-      </w:r>
-      <w:proofErr w:type="spellStart"/>
-      <w:r>
-        <w:t>request</w:t>
-      </w:r>
-      <w:proofErr w:type="spellEnd"/>
-      <w:r>
-        <w:t xml:space="preserve"> (con eventuale descrizione) </w:t>
+        <w:t xml:space="preserve">-Pull request (con eventuale descrizione) </w:t>
       </w:r>
     </w:p>
     <w:p>
@@ -1463,16 +893,94 @@
         <w:spacing w:after="0" w:line="276" w:lineRule="auto"/>
       </w:pPr>
       <w:r>
-        <w:t xml:space="preserve">Nota: questa metodologia è stata utilizzata un numero limitato di volte, data la dimensione ridotta del team e dati i frequenti meeting in cui il team verificava direttamente le modifiche esposte dal membro che aveva preso in carico la </w:t>
-      </w:r>
-      <w:proofErr w:type="spellStart"/>
-      <w:r>
-        <w:t>issue</w:t>
-      </w:r>
-      <w:proofErr w:type="spellEnd"/>
-      <w:r>
-        <w:t xml:space="preserve"> o il problema da risolvere. Gran parte delle revisioni sono dunque avvenute tramite revisione sincrona durante i Daily Scrum.</w:t>
-      </w:r>
+        <w:t>Nota: questa metodologia è stata utilizzata un numero limitato di volte, data la dimensione ridotta del team e dati i frequenti meeting in cui il team verificava direttamente le modifiche esposte dal membro che aveva preso in carico la issue o il problema da risolvere. Gran parte delle revisioni sono dunque avvenute tramite revisione sincrona durante i Daily Scrum.</w:t>
+      </w:r>
+    </w:p>
+    <w:p>
+      <w:pPr>
+        <w:pStyle w:val="Paragrafoelenco"/>
+        <w:tabs>
+          <w:tab w:val="left" w:pos="1888"/>
+        </w:tabs>
+        <w:spacing w:after="0" w:line="276" w:lineRule="auto"/>
+      </w:pPr>
+    </w:p>
+    <w:p>
+      <w:pPr>
+        <w:pStyle w:val="Paragrafoelenco"/>
+        <w:tabs>
+          <w:tab w:val="left" w:pos="1888"/>
+        </w:tabs>
+        <w:spacing w:after="0" w:line="276" w:lineRule="auto"/>
+        <w:jc w:val="center"/>
+      </w:pPr>
+      <w:r>
+        <w:rPr>
+          <w:noProof/>
+        </w:rPr>
+        <w:drawing>
+          <wp:inline distT="0" distB="0" distL="0" distR="0" wp14:anchorId="4406F148">
+            <wp:extent cx="4620260" cy="2321302"/>
+            <wp:effectExtent l="0" t="0" r="0" b="3175"/>
+            <wp:docPr id="1565431722" name="Immagine 3"/>
+            <wp:cNvGraphicFramePr>
+              <a:graphicFrameLocks xmlns:a="http://schemas.openxmlformats.org/drawingml/2006/main" noChangeAspect="1"/>
+            </wp:cNvGraphicFramePr>
+            <a:graphic xmlns:a="http://schemas.openxmlformats.org/drawingml/2006/main">
+              <a:graphicData uri="http://schemas.openxmlformats.org/drawingml/2006/picture">
+                <pic:pic xmlns:pic="http://schemas.openxmlformats.org/drawingml/2006/picture">
+                  <pic:nvPicPr>
+                    <pic:cNvPr id="0" name="Picture 3"/>
+                    <pic:cNvPicPr>
+                      <a:picLocks noChangeAspect="1" noChangeArrowheads="1"/>
+                    </pic:cNvPicPr>
+                  </pic:nvPicPr>
+                  <pic:blipFill rotWithShape="1">
+                    <a:blip r:embed="rId8">
+                      <a:extLst>
+                        <a:ext uri="{28A0092B-C50C-407E-A947-70E740481C1C}">
+                          <a14:useLocalDpi xmlns:a14="http://schemas.microsoft.com/office/drawing/2010/main" val="0"/>
+                        </a:ext>
+                      </a:extLst>
+                    </a:blip>
+                    <a:srcRect t="7965"/>
+                    <a:stretch>
+                      <a:fillRect/>
+                    </a:stretch>
+                  </pic:blipFill>
+                  <pic:spPr bwMode="auto">
+                    <a:xfrm>
+                      <a:off x="0" y="0"/>
+                      <a:ext cx="4632541" cy="2327472"/>
+                    </a:xfrm>
+                    <a:prstGeom prst="rect">
+                      <a:avLst/>
+                    </a:prstGeom>
+                    <a:noFill/>
+                    <a:ln>
+                      <a:noFill/>
+                    </a:ln>
+                    <a:extLst>
+                      <a:ext uri="{53640926-AAD7-44D8-BBD7-CCE9431645EC}">
+                        <a14:shadowObscured xmlns:a14="http://schemas.microsoft.com/office/drawing/2010/main"/>
+                      </a:ext>
+                    </a:extLst>
+                  </pic:spPr>
+                </pic:pic>
+              </a:graphicData>
+            </a:graphic>
+          </wp:inline>
+        </w:drawing>
+      </w:r>
+    </w:p>
+    <w:p>
+      <w:pPr>
+        <w:pStyle w:val="Paragrafoelenco"/>
+        <w:tabs>
+          <w:tab w:val="left" w:pos="1888"/>
+        </w:tabs>
+        <w:spacing w:after="0" w:line="276" w:lineRule="auto"/>
+      </w:pPr>
     </w:p>
     <w:p/>
     <w:p>
@@ -1497,7 +1005,23 @@
           <w:iCs/>
           <w:u w:val="single"/>
         </w:rPr>
-        <w:t xml:space="preserve"> (al 10/01/2026)</w:t>
+        <w:t xml:space="preserve"> (al </w:t>
+      </w:r>
+      <w:r>
+        <w:rPr>
+          <w:i/>
+          <w:iCs/>
+          <w:u w:val="single"/>
+        </w:rPr>
+        <w:t>29</w:t>
+      </w:r>
+      <w:r>
+        <w:rPr>
+          <w:i/>
+          <w:iCs/>
+          <w:u w:val="single"/>
+        </w:rPr>
+        <w:t>/01/2026)</w:t>
       </w:r>
     </w:p>
     <w:p>
@@ -1509,15 +1033,10 @@
         </w:numPr>
       </w:pPr>
       <w:r>
-        <w:t xml:space="preserve">Numero totale di </w:t>
-      </w:r>
-      <w:proofErr w:type="spellStart"/>
-      <w:r>
-        <w:t>commit</w:t>
-      </w:r>
-      <w:proofErr w:type="spellEnd"/>
-      <w:r>
-        <w:t>: 236</w:t>
+        <w:t>Numero totale di commit: 2</w:t>
+      </w:r>
+      <w:r>
+        <w:t>50</w:t>
       </w:r>
     </w:p>
     <w:p>
@@ -1534,15 +1053,10 @@
         </w:numPr>
       </w:pPr>
       <w:r>
-        <w:t xml:space="preserve">Numero di </w:t>
-      </w:r>
-      <w:proofErr w:type="spellStart"/>
-      <w:r>
-        <w:t>issue</w:t>
-      </w:r>
-      <w:proofErr w:type="spellEnd"/>
-      <w:r>
-        <w:t xml:space="preserve"> gestite: 34</w:t>
+        <w:t>Numero di issue gestite: 3</w:t>
+      </w:r>
+      <w:r>
+        <w:t>5</w:t>
       </w:r>
     </w:p>
     <w:p>
@@ -1559,15 +1073,7 @@
         </w:numPr>
       </w:pPr>
       <w:r>
-        <w:t xml:space="preserve">Numero di pull </w:t>
-      </w:r>
-      <w:proofErr w:type="spellStart"/>
-      <w:r>
-        <w:t>request</w:t>
-      </w:r>
-      <w:proofErr w:type="spellEnd"/>
-      <w:r>
-        <w:t xml:space="preserve">: 5 </w:t>
+        <w:t>Branch utilizzati: 9</w:t>
       </w:r>
     </w:p>
     <w:p>
@@ -1583,25 +1089,33 @@
           <w:numId w:val="3"/>
         </w:numPr>
       </w:pPr>
-      <w:proofErr w:type="spellStart"/>
-      <w:r>
-        <w:t>Contributors</w:t>
-      </w:r>
-      <w:proofErr w:type="spellEnd"/>
-      <w:r>
-        <w:t>: 4 (ciascuno con il proprio ruolo)</w:t>
-      </w:r>
-    </w:p>
-    <w:p/>
-    <w:p/>
-    <w:p/>
-    <w:p/>
-    <w:p/>
-    <w:p/>
-    <w:p/>
-    <w:p/>
-    <w:p/>
-    <w:p/>
+      <w:r>
+        <w:t xml:space="preserve">Numero di pull request: </w:t>
+      </w:r>
+      <w:r>
+        <w:t>7</w:t>
+      </w:r>
+    </w:p>
+    <w:p>
+      <w:pPr>
+        <w:pStyle w:val="Paragrafoelenco"/>
+      </w:pPr>
+    </w:p>
+    <w:p>
+      <w:pPr>
+        <w:pStyle w:val="Paragrafoelenco"/>
+        <w:numPr>
+          <w:ilvl w:val="0"/>
+          <w:numId w:val="3"/>
+        </w:numPr>
+      </w:pPr>
+      <w:r>
+        <w:t>Contributors: 4 (ciascuno con il proprio ruolo</w:t>
+      </w:r>
+      <w:r>
+        <w:t>)</w:t>
+      </w:r>
+    </w:p>
     <w:p/>
     <w:p>
       <w:pPr>
@@ -1615,16 +1129,17 @@
           <w:b/>
           <w:bCs/>
         </w:rPr>
-        <w:lastRenderedPageBreak/>
         <w:t>People Management and Team Organization</w:t>
       </w:r>
     </w:p>
     <w:p>
-      <w:r>
-        <w:t>DEVE dire le persone e l’organizzazione del lavoro tra le persone (rifacendosi ad uno schema del libro) Documentazione: aggiungere al documento (1) la documentazione riguardante questo punto.</w:t>
-      </w:r>
-    </w:p>
-    <w:p/>
+      <w:pPr>
+        <w:rPr>
+          <w:b/>
+          <w:bCs/>
+        </w:rPr>
+      </w:pPr>
+    </w:p>
     <w:p>
       <w:pPr>
         <w:rPr>
@@ -2113,21 +1628,8 @@
           <w:numId w:val="5"/>
         </w:numPr>
       </w:pPr>
-      <w:proofErr w:type="spellStart"/>
-      <w:r>
-        <w:t>Github</w:t>
-      </w:r>
-      <w:proofErr w:type="spellEnd"/>
-      <w:r>
-        <w:t xml:space="preserve">: documentazione, </w:t>
-      </w:r>
-      <w:proofErr w:type="spellStart"/>
-      <w:r>
-        <w:t>issues</w:t>
-      </w:r>
-      <w:proofErr w:type="spellEnd"/>
-      <w:r>
-        <w:t xml:space="preserve">  e commenti</w:t>
+      <w:r>
+        <w:t>Github: documentazione, issues  e commenti</w:t>
       </w:r>
     </w:p>
     <w:sectPr>
@@ -2434,6 +1936,119 @@
     </w:lvl>
   </w:abstractNum>
   <w:abstractNum w:abstractNumId="3" w15:restartNumberingAfterBreak="0">
+    <w:nsid w:val="23CA2F07"/>
+    <w:multiLevelType w:val="hybridMultilevel"/>
+    <w:tmpl w:val="DBFA9534"/>
+    <w:lvl w:ilvl="0" w:tplc="04100001">
+      <w:start w:val="1"/>
+      <w:numFmt w:val="bullet"/>
+      <w:lvlText w:val=""/>
+      <w:lvlJc w:val="left"/>
+      <w:pPr>
+        <w:ind w:left="768" w:hanging="360"/>
+      </w:pPr>
+      <w:rPr>
+        <w:rFonts w:ascii="Symbol" w:hAnsi="Symbol" w:hint="default"/>
+      </w:rPr>
+    </w:lvl>
+    <w:lvl w:ilvl="1" w:tplc="04100003" w:tentative="1">
+      <w:start w:val="1"/>
+      <w:numFmt w:val="bullet"/>
+      <w:lvlText w:val="o"/>
+      <w:lvlJc w:val="left"/>
+      <w:pPr>
+        <w:ind w:left="1488" w:hanging="360"/>
+      </w:pPr>
+      <w:rPr>
+        <w:rFonts w:ascii="Courier New" w:hAnsi="Courier New" w:cs="Courier New" w:hint="default"/>
+      </w:rPr>
+    </w:lvl>
+    <w:lvl w:ilvl="2" w:tplc="04100005" w:tentative="1">
+      <w:start w:val="1"/>
+      <w:numFmt w:val="bullet"/>
+      <w:lvlText w:val=""/>
+      <w:lvlJc w:val="left"/>
+      <w:pPr>
+        <w:ind w:left="2208" w:hanging="360"/>
+      </w:pPr>
+      <w:rPr>
+        <w:rFonts w:ascii="Wingdings" w:hAnsi="Wingdings" w:hint="default"/>
+      </w:rPr>
+    </w:lvl>
+    <w:lvl w:ilvl="3" w:tplc="04100001" w:tentative="1">
+      <w:start w:val="1"/>
+      <w:numFmt w:val="bullet"/>
+      <w:lvlText w:val=""/>
+      <w:lvlJc w:val="left"/>
+      <w:pPr>
+        <w:ind w:left="2928" w:hanging="360"/>
+      </w:pPr>
+      <w:rPr>
+        <w:rFonts w:ascii="Symbol" w:hAnsi="Symbol" w:hint="default"/>
+      </w:rPr>
+    </w:lvl>
+    <w:lvl w:ilvl="4" w:tplc="04100003" w:tentative="1">
+      <w:start w:val="1"/>
+      <w:numFmt w:val="bullet"/>
+      <w:lvlText w:val="o"/>
+      <w:lvlJc w:val="left"/>
+      <w:pPr>
+        <w:ind w:left="3648" w:hanging="360"/>
+      </w:pPr>
+      <w:rPr>
+        <w:rFonts w:ascii="Courier New" w:hAnsi="Courier New" w:cs="Courier New" w:hint="default"/>
+      </w:rPr>
+    </w:lvl>
+    <w:lvl w:ilvl="5" w:tplc="04100005" w:tentative="1">
+      <w:start w:val="1"/>
+      <w:numFmt w:val="bullet"/>
+      <w:lvlText w:val=""/>
+      <w:lvlJc w:val="left"/>
+      <w:pPr>
+        <w:ind w:left="4368" w:hanging="360"/>
+      </w:pPr>
+      <w:rPr>
+        <w:rFonts w:ascii="Wingdings" w:hAnsi="Wingdings" w:hint="default"/>
+      </w:rPr>
+    </w:lvl>
+    <w:lvl w:ilvl="6" w:tplc="04100001" w:tentative="1">
+      <w:start w:val="1"/>
+      <w:numFmt w:val="bullet"/>
+      <w:lvlText w:val=""/>
+      <w:lvlJc w:val="left"/>
+      <w:pPr>
+        <w:ind w:left="5088" w:hanging="360"/>
+      </w:pPr>
+      <w:rPr>
+        <w:rFonts w:ascii="Symbol" w:hAnsi="Symbol" w:hint="default"/>
+      </w:rPr>
+    </w:lvl>
+    <w:lvl w:ilvl="7" w:tplc="04100003" w:tentative="1">
+      <w:start w:val="1"/>
+      <w:numFmt w:val="bullet"/>
+      <w:lvlText w:val="o"/>
+      <w:lvlJc w:val="left"/>
+      <w:pPr>
+        <w:ind w:left="5808" w:hanging="360"/>
+      </w:pPr>
+      <w:rPr>
+        <w:rFonts w:ascii="Courier New" w:hAnsi="Courier New" w:cs="Courier New" w:hint="default"/>
+      </w:rPr>
+    </w:lvl>
+    <w:lvl w:ilvl="8" w:tplc="04100005" w:tentative="1">
+      <w:start w:val="1"/>
+      <w:numFmt w:val="bullet"/>
+      <w:lvlText w:val=""/>
+      <w:lvlJc w:val="left"/>
+      <w:pPr>
+        <w:ind w:left="6528" w:hanging="360"/>
+      </w:pPr>
+      <w:rPr>
+        <w:rFonts w:ascii="Wingdings" w:hAnsi="Wingdings" w:hint="default"/>
+      </w:rPr>
+    </w:lvl>
+  </w:abstractNum>
+  <w:abstractNum w:abstractNumId="4" w15:restartNumberingAfterBreak="0">
     <w:nsid w:val="3E4C3381"/>
     <w:multiLevelType w:val="hybridMultilevel"/>
     <w:tmpl w:val="35AC7482"/>
@@ -2522,7 +2137,120 @@
       </w:pPr>
     </w:lvl>
   </w:abstractNum>
-  <w:abstractNum w:abstractNumId="4" w15:restartNumberingAfterBreak="0">
+  <w:abstractNum w:abstractNumId="5" w15:restartNumberingAfterBreak="0">
+    <w:nsid w:val="4BAC4BDB"/>
+    <w:multiLevelType w:val="hybridMultilevel"/>
+    <w:tmpl w:val="C57EFCCE"/>
+    <w:lvl w:ilvl="0" w:tplc="04100001">
+      <w:start w:val="1"/>
+      <w:numFmt w:val="bullet"/>
+      <w:lvlText w:val=""/>
+      <w:lvlJc w:val="left"/>
+      <w:pPr>
+        <w:ind w:left="720" w:hanging="360"/>
+      </w:pPr>
+      <w:rPr>
+        <w:rFonts w:ascii="Symbol" w:hAnsi="Symbol" w:hint="default"/>
+      </w:rPr>
+    </w:lvl>
+    <w:lvl w:ilvl="1" w:tplc="04100003" w:tentative="1">
+      <w:start w:val="1"/>
+      <w:numFmt w:val="bullet"/>
+      <w:lvlText w:val="o"/>
+      <w:lvlJc w:val="left"/>
+      <w:pPr>
+        <w:ind w:left="1440" w:hanging="360"/>
+      </w:pPr>
+      <w:rPr>
+        <w:rFonts w:ascii="Courier New" w:hAnsi="Courier New" w:cs="Courier New" w:hint="default"/>
+      </w:rPr>
+    </w:lvl>
+    <w:lvl w:ilvl="2" w:tplc="04100005" w:tentative="1">
+      <w:start w:val="1"/>
+      <w:numFmt w:val="bullet"/>
+      <w:lvlText w:val=""/>
+      <w:lvlJc w:val="left"/>
+      <w:pPr>
+        <w:ind w:left="2160" w:hanging="360"/>
+      </w:pPr>
+      <w:rPr>
+        <w:rFonts w:ascii="Wingdings" w:hAnsi="Wingdings" w:hint="default"/>
+      </w:rPr>
+    </w:lvl>
+    <w:lvl w:ilvl="3" w:tplc="04100001" w:tentative="1">
+      <w:start w:val="1"/>
+      <w:numFmt w:val="bullet"/>
+      <w:lvlText w:val=""/>
+      <w:lvlJc w:val="left"/>
+      <w:pPr>
+        <w:ind w:left="2880" w:hanging="360"/>
+      </w:pPr>
+      <w:rPr>
+        <w:rFonts w:ascii="Symbol" w:hAnsi="Symbol" w:hint="default"/>
+      </w:rPr>
+    </w:lvl>
+    <w:lvl w:ilvl="4" w:tplc="04100003" w:tentative="1">
+      <w:start w:val="1"/>
+      <w:numFmt w:val="bullet"/>
+      <w:lvlText w:val="o"/>
+      <w:lvlJc w:val="left"/>
+      <w:pPr>
+        <w:ind w:left="3600" w:hanging="360"/>
+      </w:pPr>
+      <w:rPr>
+        <w:rFonts w:ascii="Courier New" w:hAnsi="Courier New" w:cs="Courier New" w:hint="default"/>
+      </w:rPr>
+    </w:lvl>
+    <w:lvl w:ilvl="5" w:tplc="04100005" w:tentative="1">
+      <w:start w:val="1"/>
+      <w:numFmt w:val="bullet"/>
+      <w:lvlText w:val=""/>
+      <w:lvlJc w:val="left"/>
+      <w:pPr>
+        <w:ind w:left="4320" w:hanging="360"/>
+      </w:pPr>
+      <w:rPr>
+        <w:rFonts w:ascii="Wingdings" w:hAnsi="Wingdings" w:hint="default"/>
+      </w:rPr>
+    </w:lvl>
+    <w:lvl w:ilvl="6" w:tplc="04100001" w:tentative="1">
+      <w:start w:val="1"/>
+      <w:numFmt w:val="bullet"/>
+      <w:lvlText w:val=""/>
+      <w:lvlJc w:val="left"/>
+      <w:pPr>
+        <w:ind w:left="5040" w:hanging="360"/>
+      </w:pPr>
+      <w:rPr>
+        <w:rFonts w:ascii="Symbol" w:hAnsi="Symbol" w:hint="default"/>
+      </w:rPr>
+    </w:lvl>
+    <w:lvl w:ilvl="7" w:tplc="04100003" w:tentative="1">
+      <w:start w:val="1"/>
+      <w:numFmt w:val="bullet"/>
+      <w:lvlText w:val="o"/>
+      <w:lvlJc w:val="left"/>
+      <w:pPr>
+        <w:ind w:left="5760" w:hanging="360"/>
+      </w:pPr>
+      <w:rPr>
+        <w:rFonts w:ascii="Courier New" w:hAnsi="Courier New" w:cs="Courier New" w:hint="default"/>
+      </w:rPr>
+    </w:lvl>
+    <w:lvl w:ilvl="8" w:tplc="04100005" w:tentative="1">
+      <w:start w:val="1"/>
+      <w:numFmt w:val="bullet"/>
+      <w:lvlText w:val=""/>
+      <w:lvlJc w:val="left"/>
+      <w:pPr>
+        <w:ind w:left="6480" w:hanging="360"/>
+      </w:pPr>
+      <w:rPr>
+        <w:rFonts w:ascii="Wingdings" w:hAnsi="Wingdings" w:hint="default"/>
+      </w:rPr>
+    </w:lvl>
+  </w:abstractNum>
+  <w:abstractNum w:abstractNumId="6" w15:restartNumberingAfterBreak="0">
     <w:nsid w:val="778D3672"/>
     <w:multiLevelType w:val="hybridMultilevel"/>
     <w:tmpl w:val="DD385BE8"/>
@@ -2612,19 +2340,25 @@
     </w:lvl>
   </w:abstractNum>
   <w:num w:numId="1" w16cid:durableId="679819934">
-    <w:abstractNumId w:val="4"/>
+    <w:abstractNumId w:val="6"/>
   </w:num>
   <w:num w:numId="2" w16cid:durableId="1103920818">
     <w:abstractNumId w:val="1"/>
   </w:num>
   <w:num w:numId="3" w16cid:durableId="2098747139">
-    <w:abstractNumId w:val="3"/>
+    <w:abstractNumId w:val="4"/>
   </w:num>
   <w:num w:numId="4" w16cid:durableId="2087914593">
     <w:abstractNumId w:val="2"/>
   </w:num>
   <w:num w:numId="5" w16cid:durableId="896205552">
     <w:abstractNumId w:val="0"/>
+  </w:num>
+  <w:num w:numId="6" w16cid:durableId="951328134">
+    <w:abstractNumId w:val="5"/>
+  </w:num>
+  <w:num w:numId="7" w16cid:durableId="1926844021">
+    <w:abstractNumId w:val="3"/>
   </w:num>
 </w:numbering>
 </file>

</xml_diff>